<commit_message>
v1.0.15 nezha verification appended to docs/changelogs/v1.0.15.md + .gitignore pycache cleanup. Nezha Linux ALT 6.12 x86_64 GREEN: verify-only PASS=38/0/SKIP=10 (all SKIPs §11.4.3 honest), tests 45/46/47/48 individually PASS=5+5+8+8 (SKIPs only T5 headless-clipboard), meta 41/4/8 (4 ESCAPES = 2 pre-existing P5-M20/M21 + 2 nezha-CodeGraph-env-state per Issues.md B3), e2e PASS=9/0/0, go test ./cmd/workable-items/... ok (Linux build + tests).
Signed-off-by: Milos Vasic <i@mvasic.ru>
</commit_message>
<xml_diff>
--- a/docs/changelogs/v1.0.15.docx
+++ b/docs/changelogs/v1.0.15.docx
@@ -2096,24 +2096,395 @@
         <w:pStyle w:val="FirstParagraph"/>
       </w:pPr>
       <w:r>
-        <w:t xml:space="preserve">To be populated after PWU-E nezha deploy step.</w:t>
-      </w:r>
-    </w:p>
-    <w:p>
-      <w:r>
-        <w:pict>
-          <v:rect style="width:0;height:1.5pt" o:hralign="center" o:hrstd="t" o:hr="t"/>
-        </w:pict>
-      </w:r>
-    </w:p>
-    <w:bookmarkEnd w:id="21"/>
-    <w:bookmarkStart w:id="22" w:name="Xc25fa332dfd022e9674068de2cfd2505a891549"/>
-    <w:p>
-      <w:pPr>
-        <w:pStyle w:val="Heading2"/>
-      </w:pPr>
-      <w:r>
-        <w:t xml:space="preserve">Honest gaps (out of scope, tracked per §11.4.6)</w:t>
+        <w:t xml:space="preserve">Multi-host deploy executed via</w:t>
+      </w:r>
+      <w:r>
+        <w:t xml:space="preserve"> </w:t>
+      </w:r>
+      <w:r>
+        <w:rPr>
+          <w:rStyle w:val="VerbatimChar"/>
+        </w:rPr>
+        <w:t xml:space="preserve">ssh nezha.local</w:t>
+      </w:r>
+      <w:r>
+        <w:t xml:space="preserve"> </w:t>
+      </w:r>
+      <w:r>
+        <w:t xml:space="preserve">(per the</w:t>
+      </w:r>
+      <w:r>
+        <w:t xml:space="preserve"> </w:t>
+      </w:r>
+      <w:r>
+        <w:rPr>
+          <w:rStyle w:val="VerbatimChar"/>
+        </w:rPr>
+        <w:t xml:space="preserve">~/nezha</w:t>
+      </w:r>
+      <w:r>
+        <w:t xml:space="preserve"> </w:t>
+      </w:r>
+      <w:r>
+        <w:t xml:space="preserve">SSH script). After</w:t>
+      </w:r>
+      <w:r>
+        <w:t xml:space="preserve"> </w:t>
+      </w:r>
+      <w:r>
+        <w:rPr>
+          <w:rStyle w:val="VerbatimChar"/>
+        </w:rPr>
+        <w:t xml:space="preserve">git pull --ff-only github main</w:t>
+      </w:r>
+      <w:r>
+        <w:t xml:space="preserve"> </w:t>
+      </w:r>
+      <w:r>
+        <w:t xml:space="preserve">(+ submodule</w:t>
+      </w:r>
+      <w:r>
+        <w:t xml:space="preserve"> </w:t>
+      </w:r>
+      <w:r>
+        <w:t xml:space="preserve">update --init --recursive that brought constitution</w:t>
+      </w:r>
+      <w:r>
+        <w:t xml:space="preserve"> </w:t>
+      </w:r>
+      <w:r>
+        <w:rPr>
+          <w:rStyle w:val="VerbatimChar"/>
+        </w:rPr>
+        <w:t xml:space="preserve">6828ff2</w:t>
+      </w:r>
+      <w:r>
+        <w:t xml:space="preserve"> </w:t>
+      </w:r>
+      <w:r>
+        <w:t xml:space="preserve">+</w:t>
+      </w:r>
+      <w:r>
+        <w:t xml:space="preserve"> </w:t>
+      </w:r>
+      <w:r>
+        <w:t xml:space="preserve">Containers</w:t>
+      </w:r>
+      <w:r>
+        <w:t xml:space="preserve"> </w:t>
+      </w:r>
+      <w:r>
+        <w:rPr>
+          <w:rStyle w:val="VerbatimChar"/>
+        </w:rPr>
+        <w:t xml:space="preserve">2e9ca0e</w:t>
+      </w:r>
+      <w:r>
+        <w:t xml:space="preserve"> </w:t>
+      </w:r>
+      <w:r>
+        <w:t xml:space="preserve">to nezha):</w:t>
+      </w:r>
+    </w:p>
+    <w:tbl>
+      <w:tblPr>
+        <w:tblStyle w:val="Table"/>
+        <w:tblW w:type="auto" w:w="0"/>
+        <w:tblLook w:firstRow="1" w:lastRow="0" w:firstColumn="0" w:lastColumn="0" w:noHBand="0" w:noVBand="0" w:val="0020"/>
+      </w:tblPr>
+      <w:tblGrid>
+        <w:gridCol w:w="3960"/>
+        <w:gridCol w:w="3960"/>
+      </w:tblGrid>
+      <w:tr>
+        <w:trPr>
+          <w:tblHeader w:val="on"/>
+        </w:trPr>
+        <w:tc>
+          <w:tcPr/>
+          <w:p>
+            <w:pPr>
+              <w:pStyle w:val="Compact"/>
+            </w:pPr>
+            <w:r>
+              <w:t xml:space="preserve">Gate</w:t>
+            </w:r>
+          </w:p>
+        </w:tc>
+        <w:tc>
+          <w:tcPr/>
+          <w:p>
+            <w:pPr>
+              <w:pStyle w:val="Compact"/>
+            </w:pPr>
+            <w:r>
+              <w:t xml:space="preserve">Result</w:t>
+            </w:r>
+          </w:p>
+        </w:tc>
+      </w:tr>
+      <w:tr>
+        <w:tc>
+          <w:tcPr/>
+          <w:p>
+            <w:pPr>
+              <w:pStyle w:val="Compact"/>
+            </w:pPr>
+            <w:r>
+              <w:rPr>
+                <w:rStyle w:val="VerbatimChar"/>
+              </w:rPr>
+              <w:t xml:space="preserve">bash scripts/setup.sh --rebuild</w:t>
+            </w:r>
+          </w:p>
+        </w:tc>
+        <w:tc>
+          <w:tcPr/>
+          <w:p>
+            <w:pPr>
+              <w:pStyle w:val="Compact"/>
+            </w:pPr>
+            <w:r>
+              <w:t xml:space="preserve">GREEN</w:t>
+            </w:r>
+          </w:p>
+        </w:tc>
+      </w:tr>
+      <w:tr>
+        <w:tc>
+          <w:tcPr/>
+          <w:p>
+            <w:pPr>
+              <w:pStyle w:val="Compact"/>
+            </w:pPr>
+            <w:r>
+              <w:rPr>
+                <w:rStyle w:val="VerbatimChar"/>
+              </w:rPr>
+              <w:t xml:space="preserve">bash scripts/setup.sh --verify-only</w:t>
+            </w:r>
+          </w:p>
+        </w:tc>
+        <w:tc>
+          <w:tcPr/>
+          <w:p>
+            <w:pPr>
+              <w:pStyle w:val="Compact"/>
+            </w:pPr>
+            <w:r>
+              <w:rPr>
+                <w:b/>
+                <w:bCs/>
+              </w:rPr>
+              <w:t xml:space="preserve">SUMMARY: PASS=38 FAIL=0 SKIP=10</w:t>
+            </w:r>
+          </w:p>
+        </w:tc>
+      </w:tr>
+      <w:tr>
+        <w:tc>
+          <w:tcPr/>
+          <w:p>
+            <w:pPr>
+              <w:pStyle w:val="Compact"/>
+            </w:pPr>
+            <w:r>
+              <w:t xml:space="preserve">Test 45 (multi-line copy)</w:t>
+            </w:r>
+          </w:p>
+        </w:tc>
+        <w:tc>
+          <w:tcPr/>
+          <w:p>
+            <w:pPr>
+              <w:pStyle w:val="Compact"/>
+            </w:pPr>
+            <w:r>
+              <w:t xml:space="preserve">PASS=5/0/SKIP=1 (T5 honest — no clipboard tool on headless Linux)</w:t>
+            </w:r>
+          </w:p>
+        </w:tc>
+      </w:tr>
+      <w:tr>
+        <w:tc>
+          <w:tcPr/>
+          <w:p>
+            <w:pPr>
+              <w:pStyle w:val="Compact"/>
+            </w:pPr>
+            <w:r>
+              <w:t xml:space="preserve">Test 46 (paste-IN)</w:t>
+            </w:r>
+          </w:p>
+        </w:tc>
+        <w:tc>
+          <w:tcPr/>
+          <w:p>
+            <w:pPr>
+              <w:pStyle w:val="Compact"/>
+            </w:pPr>
+            <w:r>
+              <w:t xml:space="preserve">PASS=5/0/SKIP=2 (T0+T3 honest — no clipboard tool)</w:t>
+            </w:r>
+          </w:p>
+        </w:tc>
+      </w:tr>
+      <w:tr>
+        <w:tc>
+          <w:tcPr/>
+          <w:p>
+            <w:pPr>
+              <w:pStyle w:val="Compact"/>
+            </w:pPr>
+            <w:r>
+              <w:t xml:space="preserve">Test 47 (alt-screen scroll)</w:t>
+            </w:r>
+          </w:p>
+        </w:tc>
+        <w:tc>
+          <w:tcPr/>
+          <w:p>
+            <w:pPr>
+              <w:pStyle w:val="Compact"/>
+            </w:pPr>
+            <w:r>
+              <w:rPr>
+                <w:b/>
+                <w:bCs/>
+              </w:rPr>
+              <w:t xml:space="preserve">PASS=8/0/0</w:t>
+            </w:r>
+            <w:r>
+              <w:t xml:space="preserve"> </w:t>
+            </w:r>
+            <w:r>
+              <w:t xml:space="preserve">— Claude Code alt-screen scroll works on Linux too</w:t>
+            </w:r>
+          </w:p>
+        </w:tc>
+      </w:tr>
+      <w:tr>
+        <w:tc>
+          <w:tcPr/>
+          <w:p>
+            <w:pPr>
+              <w:pStyle w:val="Compact"/>
+            </w:pPr>
+            <w:r>
+              <w:t xml:space="preserve">Test 48 (modifier-drag override)</w:t>
+            </w:r>
+          </w:p>
+        </w:tc>
+        <w:tc>
+          <w:tcPr/>
+          <w:p>
+            <w:pPr>
+              <w:pStyle w:val="Compact"/>
+            </w:pPr>
+            <w:r>
+              <w:t xml:space="preserve">PASS=8/0/SKIP=1 (T5 honest)</w:t>
+            </w:r>
+          </w:p>
+        </w:tc>
+      </w:tr>
+      <w:tr>
+        <w:tc>
+          <w:tcPr/>
+          <w:p>
+            <w:pPr>
+              <w:pStyle w:val="Compact"/>
+            </w:pPr>
+            <w:r>
+              <w:rPr>
+                <w:rStyle w:val="VerbatimChar"/>
+              </w:rPr>
+              <w:t xml:space="preserve">bash scripts/tests/meta_test_false_positive_proof.sh</w:t>
+            </w:r>
+          </w:p>
+        </w:tc>
+        <w:tc>
+          <w:tcPr/>
+          <w:p>
+            <w:pPr>
+              <w:pStyle w:val="Compact"/>
+            </w:pPr>
+            <w:r>
+              <w:t xml:space="preserve">41 CAUGHT / 4 ESCAPED / 8 SKIPPED</w:t>
+            </w:r>
+          </w:p>
+        </w:tc>
+      </w:tr>
+      <w:tr>
+        <w:tc>
+          <w:tcPr/>
+          <w:p>
+            <w:pPr>
+              <w:pStyle w:val="Compact"/>
+            </w:pPr>
+            <w:r>
+              <w:rPr>
+                <w:rStyle w:val="VerbatimChar"/>
+              </w:rPr>
+              <w:t xml:space="preserve">bash scripts/test_e2e.sh</w:t>
+            </w:r>
+          </w:p>
+        </w:tc>
+        <w:tc>
+          <w:tcPr/>
+          <w:p>
+            <w:pPr>
+              <w:pStyle w:val="Compact"/>
+            </w:pPr>
+            <w:r>
+              <w:rPr>
+                <w:b/>
+                <w:bCs/>
+              </w:rPr>
+              <w:t xml:space="preserve">PASS=9/0/0 GREEN</w:t>
+            </w:r>
+          </w:p>
+        </w:tc>
+      </w:tr>
+      <w:tr>
+        <w:tc>
+          <w:tcPr/>
+          <w:p>
+            <w:pPr>
+              <w:pStyle w:val="Compact"/>
+            </w:pPr>
+            <w:r>
+              <w:rPr>
+                <w:rStyle w:val="VerbatimChar"/>
+              </w:rPr>
+              <w:t xml:space="preserve">go test ./cmd/workable-items/... -count=3</w:t>
+            </w:r>
+          </w:p>
+        </w:tc>
+        <w:tc>
+          <w:tcPr/>
+          <w:p>
+            <w:pPr>
+              <w:pStyle w:val="Compact"/>
+            </w:pPr>
+            <w:r>
+              <w:t xml:space="preserve">ok (Linux x86_64 build + all tests PASS)</w:t>
+            </w:r>
+          </w:p>
+        </w:tc>
+      </w:tr>
+    </w:tbl>
+    <w:p>
+      <w:pPr>
+        <w:pStyle w:val="BodyText"/>
+      </w:pPr>
+      <w:r>
+        <w:t xml:space="preserve">The 10 SKIPs in the full suite are §11.4.3 honest topology</w:t>
+      </w:r>
+      <w:r>
+        <w:t xml:space="preserve"> </w:t>
+      </w:r>
+      <w:r>
+        <w:t xml:space="preserve">dispatches:</w:t>
       </w:r>
     </w:p>
     <w:p>
@@ -2126,34 +2497,69 @@
       </w:pPr>
       <w:r>
         <w:rPr>
-          <w:b/>
-          <w:bCs/>
-        </w:rPr>
-        <w:t xml:space="preserve">B3 P5-M20 + P5-M21 paired-mutation ESCAPES</w:t>
-      </w:r>
-      <w:r>
-        <w:t xml:space="preserve"> </w:t>
-      </w:r>
-      <w:r>
-        <w:t xml:space="preserve">continue (pre-</w:t>
-      </w:r>
-      <w:r>
-        <w:t xml:space="preserve"> </w:t>
-      </w:r>
-      <w:r>
-        <w:t xml:space="preserve">existing v1.0.9 layer-4 design gaps in shell-session-resume PWUs).</w:t>
-      </w:r>
-      <w:r>
-        <w:t xml:space="preserve"> </w:t>
-      </w:r>
-      <w:r>
-        <w:t xml:space="preserve">Underlying features GREEN. Closure conditions documented in</w:t>
-      </w:r>
-      <w:r>
-        <w:t xml:space="preserve"> </w:t>
-      </w:r>
-      <w:r>
-        <w:t xml:space="preserve">Issues.md B3.</w:t>
+          <w:rStyle w:val="VerbatimChar"/>
+        </w:rPr>
+        <w:t xml:space="preserve">08_oom_score_adj.sh</w:t>
+      </w:r>
+      <w:r>
+        <w:t xml:space="preserve">,</w:t>
+      </w:r>
+      <w:r>
+        <w:t xml:space="preserve"> </w:t>
+      </w:r>
+      <w:r>
+        <w:rPr>
+          <w:rStyle w:val="VerbatimChar"/>
+        </w:rPr>
+        <w:t xml:space="preserve">12_memory_pressure_under_cap.sh</w:t>
+      </w:r>
+      <w:r>
+        <w:t xml:space="preserve">,</w:t>
+      </w:r>
+      <w:r>
+        <w:t xml:space="preserve"> </w:t>
+      </w:r>
+      <w:r>
+        <w:rPr>
+          <w:rStyle w:val="VerbatimChar"/>
+        </w:rPr>
+        <w:t xml:space="preserve">13_tasksmax_stress.sh</w:t>
+      </w:r>
+      <w:r>
+        <w:t xml:space="preserve">,</w:t>
+      </w:r>
+      <w:r>
+        <w:t xml:space="preserve"> </w:t>
+      </w:r>
+      <w:r>
+        <w:rPr>
+          <w:rStyle w:val="VerbatimChar"/>
+        </w:rPr>
+        <w:t xml:space="preserve">14_concurrent_oom_independence.sh</w:t>
+      </w:r>
+      <w:r>
+        <w:t xml:space="preserve"> </w:t>
+      </w:r>
+      <w:r>
+        <w:t xml:space="preserve">—</w:t>
+      </w:r>
+      <w:r>
+        <w:t xml:space="preserve"> </w:t>
+      </w:r>
+      <w:r>
+        <w:t xml:space="preserve">destructive/Linux-OOM tests gated by</w:t>
+      </w:r>
+      <w:r>
+        <w:t xml:space="preserve"> </w:t>
+      </w:r>
+      <w:r>
+        <w:rPr>
+          <w:rStyle w:val="VerbatimChar"/>
+        </w:rPr>
+        <w:t xml:space="preserve">TMX_TEST_DESTRUCTIVE=1</w:t>
+      </w:r>
+      <w:r>
+        <w:t xml:space="preserve">.</w:t>
       </w:r>
     </w:p>
     <w:p>
@@ -2166,28 +2572,15 @@
       </w:pPr>
       <w:r>
         <w:rPr>
-          <w:b/>
-          <w:bCs/>
-        </w:rPr>
-        <w:t xml:space="preserve">Workable-items live-corpus round-trip</w:t>
-      </w:r>
-      <w:r>
-        <w:t xml:space="preserve"> </w:t>
-      </w:r>
-      <w:r>
-        <w:t xml:space="preserve">not byte-identical</w:t>
-      </w:r>
-      <w:r>
-        <w:t xml:space="preserve"> </w:t>
-      </w:r>
-      <w:r>
-        <w:t xml:space="preserve">for free-form bodies; golden testdata is. Per §11.4.93 phase-6</w:t>
-      </w:r>
-      <w:r>
-        <w:t xml:space="preserve"> </w:t>
-      </w:r>
-      <w:r>
-        <w:t xml:space="preserve">migration plan.</w:t>
+          <w:rStyle w:val="VerbatimChar"/>
+        </w:rPr>
+        <w:t xml:space="preserve">32_ssh_dispatch_remote_nezha.sh</w:t>
+      </w:r>
+      <w:r>
+        <w:t xml:space="preserve"> </w:t>
+      </w:r>
+      <w:r>
+        <w:t xml:space="preserve">— nezha-self-reference.</w:t>
       </w:r>
     </w:p>
     <w:p>
@@ -2200,60 +2593,15 @@
       </w:pPr>
       <w:r>
         <w:rPr>
-          <w:b/>
-          <w:bCs/>
-        </w:rPr>
-        <w:t xml:space="preserve">Workable-items integration into</w:t>
-      </w:r>
-      <w:r>
-        <w:rPr>
-          <w:b/>
-          <w:bCs/>
-        </w:rPr>
-        <w:t xml:space="preserve"> </w:t>
-      </w:r>
-      <w:r>
-        <w:rPr>
-          <w:rStyle w:val="VerbatimChar"/>
-          <w:b/>
-          <w:bCs/>
-        </w:rPr>
-        <w:t xml:space="preserve">commit_all.sh</w:t>
-      </w:r>
-      <w:r>
-        <w:rPr>
-          <w:b/>
-          <w:bCs/>
-        </w:rPr>
-        <w:t xml:space="preserve"> </w:t>
-      </w:r>
-      <w:r>
-        <w:rPr>
-          <w:b/>
-          <w:bCs/>
-        </w:rPr>
-        <w:t xml:space="preserve">+</w:t>
-      </w:r>
-      <w:r>
-        <w:rPr>
-          <w:b/>
-          <w:bCs/>
-        </w:rPr>
-        <w:t xml:space="preserve"> </w:t>
-      </w:r>
-      <w:r>
-        <w:rPr>
-          <w:rStyle w:val="VerbatimChar"/>
-          <w:b/>
-          <w:bCs/>
-        </w:rPr>
-        <w:t xml:space="preserve">sync_issues_docs.sh</w:t>
-      </w:r>
-      <w:r>
-        <w:t xml:space="preserve"> </w:t>
-      </w:r>
-      <w:r>
-        <w:t xml:space="preserve">deferred to a follow-up cycle.</w:t>
+          <w:rStyle w:val="VerbatimChar"/>
+        </w:rPr>
+        <w:t xml:space="preserve">41_docs_user_guides_render.sh</w:t>
+      </w:r>
+      <w:r>
+        <w:t xml:space="preserve"> </w:t>
+      </w:r>
+      <w:r>
+        <w:t xml:space="preserve">— weasyprint dependency.</w:t>
       </w:r>
     </w:p>
     <w:p>
@@ -2266,108 +2614,111 @@
       </w:pPr>
       <w:r>
         <w:rPr>
+          <w:rStyle w:val="VerbatimChar"/>
+        </w:rPr>
+        <w:t xml:space="preserve">44_clipboard_copy_out_physical.sh</w:t>
+      </w:r>
+      <w:r>
+        <w:t xml:space="preserve">,</w:t>
+      </w:r>
+      <w:r>
+        <w:t xml:space="preserve"> </w:t>
+      </w:r>
+      <w:r>
+        <w:rPr>
+          <w:rStyle w:val="VerbatimChar"/>
+        </w:rPr>
+        <w:t xml:space="preserve">45_multiline_copy_physical.sh</w:t>
+      </w:r>
+      <w:r>
+        <w:t xml:space="preserve">,</w:t>
+      </w:r>
+      <w:r>
+        <w:t xml:space="preserve"> </w:t>
+      </w:r>
+      <w:r>
+        <w:rPr>
+          <w:rStyle w:val="VerbatimChar"/>
+        </w:rPr>
+        <w:t xml:space="preserve">46_paste_in_physical.sh</w:t>
+      </w:r>
+      <w:r>
+        <w:t xml:space="preserve">,</w:t>
+      </w:r>
+      <w:r>
+        <w:t xml:space="preserve"> </w:t>
+      </w:r>
+      <w:r>
+        <w:rPr>
+          <w:rStyle w:val="VerbatimChar"/>
+        </w:rPr>
+        <w:t xml:space="preserve">48_modifier_drag_override.sh</w:t>
+      </w:r>
+      <w:r>
+        <w:t xml:space="preserve"> </w:t>
+      </w:r>
+      <w:r>
+        <w:t xml:space="preserve">— the</w:t>
+      </w:r>
+      <w:r>
+        <w:t xml:space="preserve"> </w:t>
+      </w:r>
+      <w:r>
+        <w:t xml:space="preserve">PHYSICAL</w:t>
+      </w:r>
+      <w:r>
+        <w:t xml:space="preserve"> </w:t>
+      </w:r>
+      <w:r>
+        <w:rPr>
+          <w:rStyle w:val="VerbatimChar"/>
+        </w:rPr>
+        <w:t xml:space="preserve">pbpaste</w:t>
+      </w:r>
+      <w:r>
+        <w:t xml:space="preserve">-back step (T5) honestly SKIPs on headless Linux</w:t>
+      </w:r>
+      <w:r>
+        <w:t xml:space="preserve"> </w:t>
+      </w:r>
+      <w:r>
+        <w:t xml:space="preserve">with no DISPLAY/Wayland/Termux clipboard.</w:t>
+      </w:r>
+      <w:r>
+        <w:t xml:space="preserve"> </w:t>
+      </w:r>
+      <w:r>
+        <w:rPr>
           <w:b/>
           <w:bCs/>
         </w:rPr>
-        <w:t xml:space="preserve">Upstream PR for Phase 3+ logic</w:t>
-      </w:r>
-      <w:r>
-        <w:t xml:space="preserve"> </w:t>
-      </w:r>
-      <w:r>
-        <w:t xml:space="preserve">to HelixDevelopment/</w:t>
-      </w:r>
-      <w:r>
-        <w:t xml:space="preserve"> </w:t>
-      </w:r>
-      <w:r>
-        <w:t xml:space="preserve">HelixConstitution deferred (operator-blocked per</w:t>
-      </w:r>
-      <w:r>
-        <w:t xml:space="preserve"> </w:t>
-      </w:r>
-      <w:r>
-        <w:rPr>
-          <w:rStyle w:val="VerbatimChar"/>
-        </w:rPr>
-        <w:t xml:space="preserve">feedback_no_modify_constitution</w:t>
-      </w:r>
-      <w:r>
-        <w:t xml:space="preserve">; project-local implementation</w:t>
-      </w:r>
-      <w:r>
-        <w:t xml:space="preserve"> </w:t>
-      </w:r>
-      <w:r>
-        <w:t xml:space="preserve">satisfies §11.4.93/95 mandate this cycle).</w:t>
-      </w:r>
-    </w:p>
-    <w:p>
-      <w:pPr>
-        <w:pStyle w:val="Compact"/>
-        <w:numPr>
-          <w:ilvl w:val="0"/>
-          <w:numId w:val="1003"/>
-        </w:numPr>
-      </w:pPr>
+        <w:t xml:space="preserve">The binding-chain proof</w:t>
+      </w:r>
       <w:r>
         <w:rPr>
           <w:b/>
           <w:bCs/>
         </w:rPr>
-        <w:t xml:space="preserve">TMUX-CH-45 / 46 / 47 / 48 HelixQA bank entries</w:t>
-      </w:r>
-      <w:r>
-        <w:t xml:space="preserve"> </w:t>
-      </w:r>
-      <w:r>
-        <w:t xml:space="preserve">authored;</w:t>
-      </w:r>
-      <w:r>
-        <w:t xml:space="preserve"> </w:t>
-      </w:r>
-      <w:r>
-        <w:t xml:space="preserve">full bank integration follows the Challenge surface roll-out.</w:t>
-      </w:r>
-    </w:p>
-    <w:p>
-      <w:pPr>
-        <w:pStyle w:val="Compact"/>
-        <w:numPr>
-          <w:ilvl w:val="0"/>
-          <w:numId w:val="1003"/>
-        </w:numPr>
-      </w:pPr>
-      <w:r>
-        <w:rPr>
-          <w:rStyle w:val="VerbatimChar"/>
+        <w:t xml:space="preserve"> </w:t>
+      </w:r>
+      <w:r>
+        <w:rPr>
           <w:b/>
           <w:bCs/>
         </w:rPr>
-        <w:t xml:space="preserve">CME-WORKABLE-ITEMS-001</w:t>
-      </w:r>
-      <w:r>
-        <w:t xml:space="preserve"> </w:t>
-      </w:r>
-      <w:r>
-        <w:t xml:space="preserve">end-to-end Challenge deferred.</w:t>
-      </w:r>
-    </w:p>
-    <w:p>
-      <w:r>
-        <w:pict>
-          <v:rect style="width:0;height:1.5pt" o:hralign="center" o:hrstd="t" o:hr="t"/>
-        </w:pict>
-      </w:r>
-    </w:p>
-    <w:bookmarkEnd w:id="22"/>
-    <w:bookmarkStart w:id="23" w:name="forensic-anchor--redgreen-evidence"/>
-    <w:p>
-      <w:pPr>
-        <w:pStyle w:val="Heading2"/>
-      </w:pPr>
-      <w:r>
-        <w:t xml:space="preserve">Forensic anchor — RED→GREEN evidence</w:t>
+        <w:t xml:space="preserve">T1–T4 still PASSes</w:t>
+      </w:r>
+      <w:r>
+        <w:t xml:space="preserve"> </w:t>
+      </w:r>
+      <w:r>
+        <w:t xml:space="preserve">— the tests are not inert; they assert exactly</w:t>
+      </w:r>
+      <w:r>
+        <w:t xml:space="preserve"> </w:t>
+      </w:r>
+      <w:r>
+        <w:t xml:space="preserve">what is testable in this topology.</w:t>
       </w:r>
     </w:p>
     <w:p>
@@ -2375,294 +2726,28 @@
         <w:pStyle w:val="FirstParagraph"/>
       </w:pPr>
       <w:r>
-        <w:t xml:space="preserve">For tests 46 + 48 specifically (the true RED-first per §11.4.43):</w:t>
-      </w:r>
-    </w:p>
-    <w:p>
-      <w:pPr>
-        <w:pStyle w:val="BodyText"/>
-      </w:pPr>
-      <w:r>
-        <w:rPr>
-          <w:b/>
-          <w:bCs/>
-        </w:rPr>
-        <w:t xml:space="preserve">RED state (stock v1.0.14, before fix):</w:t>
-      </w:r>
-    </w:p>
-    <w:p>
-      <w:pPr>
-        <w:pStyle w:val="SourceCode"/>
-      </w:pPr>
-      <w:r>
-        <w:rPr>
-          <w:rStyle w:val="VerbatimChar"/>
-        </w:rPr>
-        <w:t xml:space="preserve">$ bash scripts/tests/46_paste_in_physical.sh</w:t>
-      </w:r>
-      <w:r>
-        <w:br/>
-      </w:r>
-      <w:r>
-        <w:rPr>
-          <w:rStyle w:val="VerbatimChar"/>
-        </w:rPr>
-        <w:t xml:space="preserve">  ✗ template MISSING: @clip-read user option</w:t>
-      </w:r>
-      <w:r>
-        <w:br/>
-      </w:r>
-      <w:r>
-        <w:rPr>
-          <w:rStyle w:val="VerbatimChar"/>
-        </w:rPr>
-        <w:t xml:space="preserve">  ✗ template MISSING: prefix+P bind to paste</w:t>
-      </w:r>
-      <w:r>
-        <w:br/>
-      </w:r>
-      <w:r>
-        <w:rPr>
-          <w:rStyle w:val="VerbatimChar"/>
-        </w:rPr>
-        <w:t xml:space="preserve">FAIL: T1: tmux.conf.template is missing the paste-IN bindings</w:t>
-      </w:r>
-      <w:r>
-        <w:br/>
-      </w:r>
-      <w:r>
-        <w:rPr>
-          <w:rStyle w:val="VerbatimChar"/>
-        </w:rPr>
-        <w:t xml:space="preserve">FAIL: T2.1: live server has no @clip-read user-option</w:t>
-      </w:r>
-      <w:r>
-        <w:br/>
-      </w:r>
-      <w:r>
-        <w:rPr>
-          <w:rStyle w:val="VerbatimChar"/>
-        </w:rPr>
-        <w:t xml:space="preserve">FAIL: T2.2: live prefix+P binding is not a paste binding</w:t>
-      </w:r>
-      <w:r>
-        <w:br/>
-      </w:r>
-      <w:r>
-        <w:rPr>
-          <w:rStyle w:val="VerbatimChar"/>
-        </w:rPr>
-        <w:t xml:space="preserve">FAIL: T3: @clip-read not set on live server</w:t>
-      </w:r>
-      <w:r>
-        <w:br/>
-      </w:r>
-      <w:r>
-        <w:rPr>
-          <w:rStyle w:val="VerbatimChar"/>
-        </w:rPr>
-        <w:t xml:space="preserve">FAIL: T4: prefix+P bind does not reference @clip-read</w:t>
-      </w:r>
-      <w:r>
-        <w:br/>
-      </w:r>
-      <w:r>
-        <w:rPr>
-          <w:rStyle w:val="VerbatimChar"/>
-        </w:rPr>
-        <w:t xml:space="preserve">  Tests: PASS=1  FAIL=5  SKIP=0</w:t>
-      </w:r>
-      <w:r>
-        <w:br/>
-      </w:r>
-      <w:r>
-        <w:br/>
-      </w:r>
-      <w:r>
-        <w:rPr>
-          <w:rStyle w:val="VerbatimChar"/>
-        </w:rPr>
-        <w:t xml:space="preserve">$ bash scripts/tests/48_modifier_drag_override.sh</w:t>
-      </w:r>
-      <w:r>
-        <w:br/>
-      </w:r>
-      <w:r>
-        <w:rPr>
-          <w:rStyle w:val="VerbatimChar"/>
-        </w:rPr>
-        <w:t xml:space="preserve">  ✗ template MISSING: M-MouseDrag1Pane override</w:t>
-      </w:r>
-      <w:r>
-        <w:br/>
-      </w:r>
-      <w:r>
-        <w:rPr>
-          <w:rStyle w:val="VerbatimChar"/>
-        </w:rPr>
-        <w:t xml:space="preserve">  ✗ template MISSING: S-MouseDrag1Pane override</w:t>
-      </w:r>
-      <w:r>
-        <w:br/>
-      </w:r>
-      <w:r>
-        <w:rPr>
-          <w:rStyle w:val="VerbatimChar"/>
-        </w:rPr>
-        <w:t xml:space="preserve">  ✗ template MISSING: M-MouseDragEnd1Pane pipe</w:t>
-      </w:r>
-      <w:r>
-        <w:br/>
-      </w:r>
-      <w:r>
-        <w:rPr>
-          <w:rStyle w:val="VerbatimChar"/>
-        </w:rPr>
-        <w:t xml:space="preserve">  ✗ template MISSING: S-MouseDragEnd1Pane pipe</w:t>
-      </w:r>
-      <w:r>
-        <w:br/>
-      </w:r>
-      <w:r>
-        <w:rPr>
-          <w:rStyle w:val="VerbatimChar"/>
-        </w:rPr>
-        <w:t xml:space="preserve">FAIL: T1, T2.1, T2.2, T2.3, T2.4, T4</w:t>
-      </w:r>
-      <w:r>
-        <w:br/>
-      </w:r>
-      <w:r>
-        <w:rPr>
-          <w:rStyle w:val="VerbatimChar"/>
-        </w:rPr>
-        <w:t xml:space="preserve">  Tests: PASS=3  FAIL=6  SKIP=0</w:t>
-      </w:r>
-    </w:p>
-    <w:p>
-      <w:pPr>
-        <w:pStyle w:val="FirstParagraph"/>
-      </w:pPr>
-      <w:r>
-        <w:rPr>
-          <w:b/>
-          <w:bCs/>
-        </w:rPr>
-        <w:t xml:space="preserve">GREEN state (post-fix on same Mistborn this run):</w:t>
-      </w:r>
-    </w:p>
-    <w:p>
-      <w:pPr>
-        <w:pStyle w:val="SourceCode"/>
-      </w:pPr>
-      <w:r>
-        <w:rPr>
-          <w:rStyle w:val="VerbatimChar"/>
-        </w:rPr>
-        <w:t xml:space="preserve">$ bash scripts/tests/46_paste_in_physical.sh</w:t>
-      </w:r>
-      <w:r>
-        <w:br/>
-      </w:r>
-      <w:r>
-        <w:rPr>
-          <w:rStyle w:val="VerbatimChar"/>
-        </w:rPr>
-        <w:t xml:space="preserve">PASS: T3: PHYSICAL paste-IN proven — clipboard marker reached</w:t>
-      </w:r>
-      <w:r>
-        <w:br/>
-      </w:r>
-      <w:r>
-        <w:rPr>
-          <w:rStyle w:val="VerbatimChar"/>
-        </w:rPr>
-        <w:t xml:space="preserve">       the tmux pane via @clip-read + paste-buffer</w:t>
-      </w:r>
-      <w:r>
-        <w:br/>
-      </w:r>
-      <w:r>
-        <w:rPr>
-          <w:rStyle w:val="VerbatimChar"/>
-        </w:rPr>
-        <w:t xml:space="preserve">  Tests: PASS=6  FAIL=0  SKIP=0</w:t>
-      </w:r>
-      <w:r>
-        <w:br/>
-      </w:r>
-      <w:r>
-        <w:br/>
-      </w:r>
-      <w:r>
-        <w:rPr>
-          <w:rStyle w:val="VerbatimChar"/>
-        </w:rPr>
-        <w:t xml:space="preserve">$ bash scripts/tests/48_modifier_drag_override.sh</w:t>
-      </w:r>
-      <w:r>
-        <w:br/>
-      </w:r>
-      <w:r>
-        <w:rPr>
-          <w:rStyle w:val="VerbatimChar"/>
-        </w:rPr>
-        <w:t xml:space="preserve">PASS: T5: SYSTEM CLIPBOARD (pbcopy/pbpaste) carries all 6 markers</w:t>
-      </w:r>
-      <w:r>
-        <w:br/>
-      </w:r>
-      <w:r>
-        <w:rPr>
-          <w:rStyle w:val="VerbatimChar"/>
-        </w:rPr>
-        <w:t xml:space="preserve">       from the keyboard-equivalent modifier-drag flow</w:t>
-      </w:r>
-      <w:r>
-        <w:br/>
-      </w:r>
-      <w:r>
-        <w:rPr>
-          <w:rStyle w:val="VerbatimChar"/>
-        </w:rPr>
-        <w:t xml:space="preserve">  Tests: PASS=9  FAIL=0  SKIP=0</w:t>
-      </w:r>
-    </w:p>
-    <w:p>
-      <w:pPr>
-        <w:pStyle w:val="FirstParagraph"/>
-      </w:pPr>
-      <w:r>
-        <w:t xml:space="preserve">This is the §11.4.43 RED→GREEN cycle proven in a single Mistborn</w:t>
-      </w:r>
-      <w:r>
-        <w:t xml:space="preserve"> </w:t>
-      </w:r>
-      <w:r>
-        <w:t xml:space="preserve">session: tests authored before fix, fail on stock code, pass after</w:t>
-      </w:r>
-      <w:r>
-        <w:t xml:space="preserve"> </w:t>
-      </w:r>
-      <w:r>
-        <w:t xml:space="preserve">fix, captured-evidence per §11.4.5.</w:t>
-      </w:r>
-    </w:p>
-    <w:p>
-      <w:r>
-        <w:pict>
-          <v:rect style="width:0;height:1.5pt" o:hralign="center" o:hrstd="t" o:hr="t"/>
-        </w:pict>
-      </w:r>
-    </w:p>
-    <w:bookmarkEnd w:id="23"/>
-    <w:bookmarkStart w:id="24" w:name="files-modified"/>
-    <w:p>
-      <w:pPr>
-        <w:pStyle w:val="Heading2"/>
-      </w:pPr>
-      <w:r>
-        <w:t xml:space="preserve">Files modified</w:t>
+        <w:t xml:space="preserve">The 4 mutation ESCAPES on nezha are the same pre-existing layer-4</w:t>
+      </w:r>
+      <w:r>
+        <w:t xml:space="preserve"> </w:t>
+      </w:r>
+      <w:r>
+        <w:t xml:space="preserve">design gaps tracked in</w:t>
+      </w:r>
+      <w:r>
+        <w:t xml:space="preserve"> </w:t>
+      </w:r>
+      <w:r>
+        <w:rPr>
+          <w:rStyle w:val="VerbatimChar"/>
+        </w:rPr>
+        <w:t xml:space="preserve">Issues.md</w:t>
+      </w:r>
+      <w:r>
+        <w:t xml:space="preserve"> </w:t>
+      </w:r>
+      <w:r>
+        <w:t xml:space="preserve">B3:</w:t>
       </w:r>
     </w:p>
     <w:p>
@@ -2675,15 +2760,19 @@
       </w:pPr>
       <w:r>
         <w:rPr>
-          <w:rStyle w:val="VerbatimChar"/>
-        </w:rPr>
-        <w:t xml:space="preserve">scripts/tmux.conf.template</w:t>
-      </w:r>
-      <w:r>
-        <w:t xml:space="preserve"> </w:t>
-      </w:r>
-      <w:r>
-        <w:t xml:space="preserve">— A37 conf additions</w:t>
+          <w:b/>
+          <w:bCs/>
+        </w:rPr>
+        <w:t xml:space="preserve">P5-M20 + P5-M21</w:t>
+      </w:r>
+      <w:r>
+        <w:t xml:space="preserve">: shared with Mistborn (pre-existing v1.0.9</w:t>
+      </w:r>
+      <w:r>
+        <w:t xml:space="preserve"> </w:t>
+      </w:r>
+      <w:r>
+        <w:t xml:space="preserve">shell-session-resume PWU layer-4 design gaps).</w:t>
       </w:r>
     </w:p>
     <w:p>
@@ -2696,265 +2785,128 @@
       </w:pPr>
       <w:r>
         <w:rPr>
-          <w:rStyle w:val="VerbatimChar"/>
-        </w:rPr>
-        <w:t xml:space="preserve">scripts/verify.sh</w:t>
-      </w:r>
-      <w:r>
-        <w:t xml:space="preserve"> </w:t>
-      </w:r>
-      <w:r>
-        <w:t xml:space="preserve">— Layer-1 gates extended (PWU-A/B/C/D)</w:t>
-      </w:r>
-    </w:p>
-    <w:p>
-      <w:pPr>
-        <w:pStyle w:val="Compact"/>
-        <w:numPr>
-          <w:ilvl w:val="0"/>
-          <w:numId w:val="1004"/>
-        </w:numPr>
-      </w:pPr>
-      <w:r>
-        <w:rPr>
-          <w:rStyle w:val="VerbatimChar"/>
-        </w:rPr>
-        <w:t xml:space="preserve">scripts/tests/meta_test_false_positive_proof.sh</w:t>
-      </w:r>
-      <w:r>
-        <w:t xml:space="preserve"> </w:t>
-      </w:r>
-      <w:r>
-        <w:t xml:space="preserve">— M46 + M48</w:t>
-      </w:r>
-    </w:p>
-    <w:p>
-      <w:pPr>
-        <w:pStyle w:val="Compact"/>
-        <w:numPr>
-          <w:ilvl w:val="0"/>
-          <w:numId w:val="1004"/>
-        </w:numPr>
-      </w:pPr>
-      <w:r>
-        <w:rPr>
-          <w:rStyle w:val="VerbatimChar"/>
-        </w:rPr>
-        <w:t xml:space="preserve">scripts/challenges/tmux.yaml</w:t>
-      </w:r>
-      <w:r>
-        <w:t xml:space="preserve"> </w:t>
-      </w:r>
-      <w:r>
-        <w:t xml:space="preserve">— TMUX-CH-45/46/47/48</w:t>
-      </w:r>
-    </w:p>
-    <w:p>
-      <w:pPr>
-        <w:pStyle w:val="Compact"/>
-        <w:numPr>
-          <w:ilvl w:val="0"/>
-          <w:numId w:val="1004"/>
-        </w:numPr>
-      </w:pPr>
-      <w:r>
-        <w:rPr>
-          <w:rStyle w:val="VerbatimChar"/>
-        </w:rPr>
-        <w:t xml:space="preserve">scripts/sync_all_markdown_exports.sh</w:t>
-      </w:r>
-      <w:r>
-        <w:t xml:space="preserve"> </w:t>
-      </w:r>
-      <w:r>
-        <w:t xml:space="preserve">— NEW (PWU-D)</w:t>
-      </w:r>
-    </w:p>
-    <w:p>
-      <w:pPr>
-        <w:pStyle w:val="Compact"/>
-        <w:numPr>
-          <w:ilvl w:val="0"/>
-          <w:numId w:val="1004"/>
-        </w:numPr>
-      </w:pPr>
-      <w:r>
-        <w:rPr>
-          <w:rStyle w:val="VerbatimChar"/>
-        </w:rPr>
-        <w:t xml:space="preserve">Constitution.md</w:t>
-      </w:r>
-      <w:r>
-        <w:t xml:space="preserve"> </w:t>
-      </w:r>
-      <w:r>
-        <w:t xml:space="preserve">/</w:t>
-      </w:r>
-      <w:r>
-        <w:t xml:space="preserve"> </w:t>
-      </w:r>
-      <w:r>
-        <w:rPr>
-          <w:rStyle w:val="VerbatimChar"/>
-        </w:rPr>
-        <w:t xml:space="preserve">CLAUDE.md</w:t>
-      </w:r>
-      <w:r>
-        <w:t xml:space="preserve"> </w:t>
-      </w:r>
-      <w:r>
-        <w:t xml:space="preserve">/</w:t>
-      </w:r>
-      <w:r>
-        <w:t xml:space="preserve"> </w:t>
-      </w:r>
-      <w:r>
-        <w:rPr>
-          <w:rStyle w:val="VerbatimChar"/>
-        </w:rPr>
-        <w:t xml:space="preserve">AGENTS.md</w:t>
-      </w:r>
-      <w:r>
-        <w:t xml:space="preserve"> </w:t>
-      </w:r>
-      <w:r>
-        <w:t xml:space="preserve">/</w:t>
-      </w:r>
-      <w:r>
-        <w:t xml:space="preserve"> </w:t>
-      </w:r>
-      <w:r>
-        <w:rPr>
-          <w:rStyle w:val="VerbatimChar"/>
-        </w:rPr>
-        <w:t xml:space="preserve">QWEN.md</w:t>
-      </w:r>
-      <w:r>
-        <w:t xml:space="preserve"> </w:t>
-      </w:r>
-      <w:r>
-        <w:t xml:space="preserve">—</w:t>
-      </w:r>
-      <w:r>
-        <w:t xml:space="preserve"> </w:t>
-      </w:r>
-      <w:r>
-        <w:t xml:space="preserve">§11.4.87..98 short-form blocks (PWU-B)</w:t>
-      </w:r>
-    </w:p>
-    <w:p>
-      <w:pPr>
-        <w:pStyle w:val="Compact"/>
-        <w:numPr>
-          <w:ilvl w:val="0"/>
-          <w:numId w:val="1004"/>
-        </w:numPr>
-      </w:pPr>
-      <w:r>
-        <w:rPr>
-          <w:rStyle w:val="VerbatimChar"/>
-        </w:rPr>
-        <w:t xml:space="preserve">.gitignore</w:t>
-      </w:r>
-      <w:r>
-        <w:t xml:space="preserve"> </w:t>
-      </w:r>
-      <w:r>
-        <w:t xml:space="preserve">— workable-items DB carve-out (PWU-C)</w:t>
-      </w:r>
-    </w:p>
-    <w:p>
-      <w:pPr>
-        <w:pStyle w:val="Compact"/>
-        <w:numPr>
-          <w:ilvl w:val="0"/>
-          <w:numId w:val="1004"/>
-        </w:numPr>
-      </w:pPr>
-      <w:r>
-        <w:rPr>
-          <w:rStyle w:val="VerbatimChar"/>
-        </w:rPr>
-        <w:t xml:space="preserve">Fixed.md</w:t>
-      </w:r>
-      <w:r>
-        <w:t xml:space="preserve"> </w:t>
-      </w:r>
-      <w:r>
-        <w:t xml:space="preserve">— A37/A38/A39/A40 closures</w:t>
-      </w:r>
-    </w:p>
-    <w:p>
-      <w:pPr>
-        <w:pStyle w:val="Compact"/>
-        <w:numPr>
-          <w:ilvl w:val="0"/>
-          <w:numId w:val="1004"/>
-        </w:numPr>
-      </w:pPr>
-      <w:r>
-        <w:rPr>
-          <w:rStyle w:val="VerbatimChar"/>
-        </w:rPr>
-        <w:t xml:space="preserve">CHANGELOG.md</w:t>
-      </w:r>
-      <w:r>
-        <w:t xml:space="preserve"> </w:t>
-      </w:r>
-      <w:r>
-        <w:t xml:space="preserve">— v1.0.15 entry</w:t>
-      </w:r>
-    </w:p>
-    <w:p>
-      <w:pPr>
-        <w:pStyle w:val="Compact"/>
-        <w:numPr>
-          <w:ilvl w:val="0"/>
-          <w:numId w:val="1004"/>
-        </w:numPr>
-      </w:pPr>
-      <w:r>
-        <w:rPr>
-          <w:rStyle w:val="VerbatimChar"/>
-        </w:rPr>
-        <w:t xml:space="preserve">CONTINUATION.md</w:t>
-      </w:r>
-      <w:r>
-        <w:t xml:space="preserve"> </w:t>
-      </w:r>
-      <w:r>
-        <w:t xml:space="preserve">— §3.16 entry + timestamp bump</w:t>
-      </w:r>
-    </w:p>
-    <w:p>
-      <w:pPr>
-        <w:pStyle w:val="Compact"/>
-        <w:numPr>
-          <w:ilvl w:val="0"/>
-          <w:numId w:val="1004"/>
-        </w:numPr>
-      </w:pPr>
-      <w:r>
-        <w:rPr>
-          <w:rStyle w:val="VerbatimChar"/>
-        </w:rPr>
-        <w:t xml:space="preserve">VERSION</w:t>
-      </w:r>
-      <w:r>
-        <w:t xml:space="preserve"> </w:t>
-      </w:r>
-      <w:r>
-        <w:t xml:space="preserve">— 1.0.14 → 1.0.15 / versionCode 15 → 16</w:t>
-      </w:r>
-    </w:p>
-    <w:bookmarkEnd w:id="24"/>
-    <w:bookmarkStart w:id="25" w:name="files-created"/>
+          <w:b/>
+          <w:bCs/>
+        </w:rPr>
+        <w:t xml:space="preserve">2 additional nezha-specific ESCAPES</w:t>
+      </w:r>
+      <w:r>
+        <w:t xml:space="preserve">: environmental state on</w:t>
+      </w:r>
+      <w:r>
+        <w:t xml:space="preserve"> </w:t>
+      </w:r>
+      <w:r>
+        <w:t xml:space="preserve">the nezha CodeGraph index/config (M22-class), per the v1.0.14 cycle</w:t>
+      </w:r>
+      <w:r>
+        <w:t xml:space="preserve"> </w:t>
+      </w:r>
+      <w:r>
+        <w:t xml:space="preserve">audit. Not v1.0.15 regressions; tracked transparently in</w:t>
+      </w:r>
+      <w:r>
+        <w:t xml:space="preserve"> </w:t>
+      </w:r>
+      <w:r>
+        <w:rPr>
+          <w:rStyle w:val="VerbatimChar"/>
+        </w:rPr>
+        <w:t xml:space="preserve">Issues.md</w:t>
+      </w:r>
+      <w:r>
+        <w:t xml:space="preserve"> </w:t>
+      </w:r>
+      <w:r>
+        <w:t xml:space="preserve">B3. Underlying features GREEN.</w:t>
+      </w:r>
+    </w:p>
+    <w:p>
+      <w:pPr>
+        <w:pStyle w:val="FirstParagraph"/>
+      </w:pPr>
+      <w:r>
+        <w:rPr>
+          <w:b/>
+          <w:bCs/>
+        </w:rPr>
+        <w:t xml:space="preserve">The libtinfo.so.6 warning</w:t>
+      </w:r>
+      <w:r>
+        <w:t xml:space="preserve"> </w:t>
+      </w:r>
+      <w:r>
+        <w:t xml:space="preserve">(</w:t>
+      </w:r>
+      <w:r>
+        <w:rPr>
+          <w:rStyle w:val="VerbatimChar"/>
+        </w:rPr>
+        <w:t xml:space="preserve">no version information available</w:t>
+      </w:r>
+      <w:r>
+        <w:t xml:space="preserve">)</w:t>
+      </w:r>
+      <w:r>
+        <w:t xml:space="preserve"> </w:t>
+      </w:r>
+      <w:r>
+        <w:t xml:space="preserve">visible in test output is a cosmetic libc symbol-version mismatch</w:t>
+      </w:r>
+      <w:r>
+        <w:t xml:space="preserve"> </w:t>
+      </w:r>
+      <w:r>
+        <w:t xml:space="preserve">between the nezha ALT 6.12 host's ncurses-bundled libtinfo and the</w:t>
+      </w:r>
+      <w:r>
+        <w:t xml:space="preserve"> </w:t>
+      </w:r>
+      <w:r>
+        <w:t xml:space="preserve">locally-built tmux's compile-time recorded version. The wrapper</w:t>
+      </w:r>
+      <w:r>
+        <w:t xml:space="preserve"> </w:t>
+      </w:r>
+      <w:r>
+        <w:t xml:space="preserve">script filters this in user-facing output via `exec 2&gt; &gt;(grep --line-</w:t>
+      </w:r>
+      <w:r>
+        <w:t xml:space="preserve"> </w:t>
+      </w:r>
+      <w:r>
+        <w:t xml:space="preserve">buffered -v 'libtinfo.so.[0-9]*: no version information available'</w:t>
+      </w:r>
+    </w:p>
+    <w:p>
+      <w:pPr>
+        <w:pStyle w:val="BlockText"/>
+      </w:pPr>
+      <w:r>
+        <w:t xml:space="preserve">&amp;2)` (per Fixed.md A30 / §11.4.81). Tests print the raw stderr; no</w:t>
+      </w:r>
+      <w:r>
+        <w:t xml:space="preserve"> </w:t>
+      </w:r>
+      <w:r>
+        <w:t xml:space="preserve">functional impact.</w:t>
+      </w:r>
+    </w:p>
+    <w:p>
+      <w:r>
+        <w:pict>
+          <v:rect style="width:0;height:1.5pt" o:hralign="center" o:hrstd="t" o:hr="t"/>
+        </w:pict>
+      </w:r>
+    </w:p>
+    <w:bookmarkEnd w:id="21"/>
+    <w:bookmarkStart w:id="22" w:name="Xc25fa332dfd022e9674068de2cfd2505a891549"/>
     <w:p>
       <w:pPr>
         <w:pStyle w:val="Heading2"/>
       </w:pPr>
       <w:r>
-        <w:t xml:space="preserve">Files created</w:t>
+        <w:t xml:space="preserve">Honest gaps (out of scope, tracked per §11.4.6)</w:t>
       </w:r>
     </w:p>
     <w:p>
@@ -2967,9 +2919,34 @@
       </w:pPr>
       <w:r>
         <w:rPr>
-          <w:rStyle w:val="VerbatimChar"/>
-        </w:rPr>
-        <w:t xml:space="preserve">scripts/tests/45_multiline_copy_physical.sh</w:t>
+          <w:b/>
+          <w:bCs/>
+        </w:rPr>
+        <w:t xml:space="preserve">B3 P5-M20 + P5-M21 paired-mutation ESCAPES</w:t>
+      </w:r>
+      <w:r>
+        <w:t xml:space="preserve"> </w:t>
+      </w:r>
+      <w:r>
+        <w:t xml:space="preserve">continue (pre-</w:t>
+      </w:r>
+      <w:r>
+        <w:t xml:space="preserve"> </w:t>
+      </w:r>
+      <w:r>
+        <w:t xml:space="preserve">existing v1.0.9 layer-4 design gaps in shell-session-resume PWUs).</w:t>
+      </w:r>
+      <w:r>
+        <w:t xml:space="preserve"> </w:t>
+      </w:r>
+      <w:r>
+        <w:t xml:space="preserve">Underlying features GREEN. Closure conditions documented in</w:t>
+      </w:r>
+      <w:r>
+        <w:t xml:space="preserve"> </w:t>
+      </w:r>
+      <w:r>
+        <w:t xml:space="preserve">Issues.md B3.</w:t>
       </w:r>
     </w:p>
     <w:p>
@@ -2982,9 +2959,28 @@
       </w:pPr>
       <w:r>
         <w:rPr>
-          <w:rStyle w:val="VerbatimChar"/>
-        </w:rPr>
-        <w:t xml:space="preserve">scripts/tests/46_paste_in_physical.sh</w:t>
+          <w:b/>
+          <w:bCs/>
+        </w:rPr>
+        <w:t xml:space="preserve">Workable-items live-corpus round-trip</w:t>
+      </w:r>
+      <w:r>
+        <w:t xml:space="preserve"> </w:t>
+      </w:r>
+      <w:r>
+        <w:t xml:space="preserve">not byte-identical</w:t>
+      </w:r>
+      <w:r>
+        <w:t xml:space="preserve"> </w:t>
+      </w:r>
+      <w:r>
+        <w:t xml:space="preserve">for free-form bodies; golden testdata is. Per §11.4.93 phase-6</w:t>
+      </w:r>
+      <w:r>
+        <w:t xml:space="preserve"> </w:t>
+      </w:r>
+      <w:r>
+        <w:t xml:space="preserve">migration plan.</w:t>
       </w:r>
     </w:p>
     <w:p>
@@ -2997,9 +2993,60 @@
       </w:pPr>
       <w:r>
         <w:rPr>
-          <w:rStyle w:val="VerbatimChar"/>
-        </w:rPr>
-        <w:t xml:space="preserve">scripts/tests/47_alt_screen_scroll.sh</w:t>
+          <w:b/>
+          <w:bCs/>
+        </w:rPr>
+        <w:t xml:space="preserve">Workable-items integration into</w:t>
+      </w:r>
+      <w:r>
+        <w:rPr>
+          <w:b/>
+          <w:bCs/>
+        </w:rPr>
+        <w:t xml:space="preserve"> </w:t>
+      </w:r>
+      <w:r>
+        <w:rPr>
+          <w:rStyle w:val="VerbatimChar"/>
+          <w:b/>
+          <w:bCs/>
+        </w:rPr>
+        <w:t xml:space="preserve">commit_all.sh</w:t>
+      </w:r>
+      <w:r>
+        <w:rPr>
+          <w:b/>
+          <w:bCs/>
+        </w:rPr>
+        <w:t xml:space="preserve"> </w:t>
+      </w:r>
+      <w:r>
+        <w:rPr>
+          <w:b/>
+          <w:bCs/>
+        </w:rPr>
+        <w:t xml:space="preserve">+</w:t>
+      </w:r>
+      <w:r>
+        <w:rPr>
+          <w:b/>
+          <w:bCs/>
+        </w:rPr>
+        <w:t xml:space="preserve"> </w:t>
+      </w:r>
+      <w:r>
+        <w:rPr>
+          <w:rStyle w:val="VerbatimChar"/>
+          <w:b/>
+          <w:bCs/>
+        </w:rPr>
+        <w:t xml:space="preserve">sync_issues_docs.sh</w:t>
+      </w:r>
+      <w:r>
+        <w:t xml:space="preserve"> </w:t>
+      </w:r>
+      <w:r>
+        <w:t xml:space="preserve">deferred to a follow-up cycle.</w:t>
       </w:r>
     </w:p>
     <w:p>
@@ -3012,9 +3059,40 @@
       </w:pPr>
       <w:r>
         <w:rPr>
-          <w:rStyle w:val="VerbatimChar"/>
-        </w:rPr>
-        <w:t xml:space="preserve">scripts/tests/48_modifier_drag_override.sh</w:t>
+          <w:b/>
+          <w:bCs/>
+        </w:rPr>
+        <w:t xml:space="preserve">Upstream PR for Phase 3+ logic</w:t>
+      </w:r>
+      <w:r>
+        <w:t xml:space="preserve"> </w:t>
+      </w:r>
+      <w:r>
+        <w:t xml:space="preserve">to HelixDevelopment/</w:t>
+      </w:r>
+      <w:r>
+        <w:t xml:space="preserve"> </w:t>
+      </w:r>
+      <w:r>
+        <w:t xml:space="preserve">HelixConstitution deferred (operator-blocked per</w:t>
+      </w:r>
+      <w:r>
+        <w:t xml:space="preserve"> </w:t>
+      </w:r>
+      <w:r>
+        <w:rPr>
+          <w:rStyle w:val="VerbatimChar"/>
+        </w:rPr>
+        <w:t xml:space="preserve">feedback_no_modify_constitution</w:t>
+      </w:r>
+      <w:r>
+        <w:t xml:space="preserve">; project-local implementation</w:t>
+      </w:r>
+      <w:r>
+        <w:t xml:space="preserve"> </w:t>
+      </w:r>
+      <w:r>
+        <w:t xml:space="preserve">satisfies §11.4.93/95 mandate this cycle).</w:t>
       </w:r>
     </w:p>
     <w:p>
@@ -3027,9 +3105,22 @@
       </w:pPr>
       <w:r>
         <w:rPr>
-          <w:rStyle w:val="VerbatimChar"/>
-        </w:rPr>
-        <w:t xml:space="preserve">scripts/tests/helpers/synthetic_alt_screen_app.py</w:t>
+          <w:b/>
+          <w:bCs/>
+        </w:rPr>
+        <w:t xml:space="preserve">TMUX-CH-45 / 46 / 47 / 48 HelixQA bank entries</w:t>
+      </w:r>
+      <w:r>
+        <w:t xml:space="preserve"> </w:t>
+      </w:r>
+      <w:r>
+        <w:t xml:space="preserve">authored;</w:t>
+      </w:r>
+      <w:r>
+        <w:t xml:space="preserve"> </w:t>
+      </w:r>
+      <w:r>
+        <w:t xml:space="preserve">full bank integration follows the Challenge surface roll-out.</w:t>
       </w:r>
     </w:p>
     <w:p>
@@ -3043,126 +3134,328 @@
       <w:r>
         <w:rPr>
           <w:rStyle w:val="VerbatimChar"/>
-        </w:rPr>
-        <w:t xml:space="preserve">cmd/workable-items/{main.go,db.go,model.go,parser.go,sync_md_to_db.go,sync_db_to_md.go,diff.go,validate.go,add.go,close.go,schema.sql,db_test.go,roundtrip_test.go}</w:t>
-      </w:r>
-    </w:p>
-    <w:p>
-      <w:pPr>
-        <w:pStyle w:val="Compact"/>
-        <w:numPr>
-          <w:ilvl w:val="0"/>
-          <w:numId w:val="1005"/>
-        </w:numPr>
-      </w:pPr>
-      <w:r>
-        <w:rPr>
-          <w:rStyle w:val="VerbatimChar"/>
-        </w:rPr>
-        <w:t xml:space="preserve">cmd/workable-items/testdata/{golden_issues.md,golden_fixed.md}</w:t>
-      </w:r>
-    </w:p>
-    <w:p>
-      <w:pPr>
-        <w:pStyle w:val="Compact"/>
-        <w:numPr>
-          <w:ilvl w:val="0"/>
-          <w:numId w:val="1005"/>
-        </w:numPr>
-      </w:pPr>
-      <w:r>
-        <w:rPr>
-          <w:rStyle w:val="VerbatimChar"/>
-        </w:rPr>
-        <w:t xml:space="preserve">go.mod</w:t>
-      </w:r>
-      <w:r>
-        <w:t xml:space="preserve"> </w:t>
-      </w:r>
-      <w:r>
-        <w:t xml:space="preserve">+</w:t>
-      </w:r>
-      <w:r>
-        <w:t xml:space="preserve"> </w:t>
-      </w:r>
-      <w:r>
-        <w:rPr>
-          <w:rStyle w:val="VerbatimChar"/>
-        </w:rPr>
-        <w:t xml:space="preserve">go.sum</w:t>
-      </w:r>
-    </w:p>
-    <w:p>
-      <w:pPr>
-        <w:pStyle w:val="Compact"/>
-        <w:numPr>
-          <w:ilvl w:val="0"/>
-          <w:numId w:val="1005"/>
-        </w:numPr>
-      </w:pPr>
-      <w:r>
-        <w:rPr>
-          <w:rStyle w:val="VerbatimChar"/>
-        </w:rPr>
-        <w:t xml:space="preserve">docs/workable_items.db</w:t>
-      </w:r>
-      <w:r>
-        <w:t xml:space="preserve"> </w:t>
-      </w:r>
-      <w:r>
-        <w:t xml:space="preserve">— SQLite DB, tracked in git per §11.4.95</w:t>
-      </w:r>
-    </w:p>
-    <w:p>
-      <w:pPr>
-        <w:pStyle w:val="Compact"/>
-        <w:numPr>
-          <w:ilvl w:val="0"/>
-          <w:numId w:val="1005"/>
-        </w:numPr>
-      </w:pPr>
-      <w:r>
-        <w:rPr>
-          <w:rStyle w:val="VerbatimChar"/>
-        </w:rPr>
-        <w:t xml:space="preserve">docs/workable-items/{Status.md,Status_Summary.md}</w:t>
-      </w:r>
-      <w:r>
-        <w:t xml:space="preserve"> </w:t>
-      </w:r>
-      <w:r>
-        <w:t xml:space="preserve">— per §11.4.45/56</w:t>
-      </w:r>
-    </w:p>
-    <w:p>
-      <w:pPr>
-        <w:pStyle w:val="Compact"/>
-        <w:numPr>
-          <w:ilvl w:val="0"/>
-          <w:numId w:val="1005"/>
-        </w:numPr>
-      </w:pPr>
-      <w:r>
-        <w:rPr>
-          <w:rStyle w:val="VerbatimChar"/>
-        </w:rPr>
-        <w:t xml:space="preserve">docs/changelogs/v1.0.15.md</w:t>
-      </w:r>
-      <w:r>
-        <w:t xml:space="preserve"> </w:t>
-      </w:r>
-      <w:r>
-        <w:t xml:space="preserve">— this file</w:t>
-      </w:r>
-    </w:p>
-    <w:bookmarkEnd w:id="25"/>
-    <w:bookmarkStart w:id="26" w:name="submodule-pointer-bumps"/>
+          <w:b/>
+          <w:bCs/>
+        </w:rPr>
+        <w:t xml:space="preserve">CME-WORKABLE-ITEMS-001</w:t>
+      </w:r>
+      <w:r>
+        <w:t xml:space="preserve"> </w:t>
+      </w:r>
+      <w:r>
+        <w:t xml:space="preserve">end-to-end Challenge deferred.</w:t>
+      </w:r>
+    </w:p>
+    <w:p>
+      <w:r>
+        <w:pict>
+          <v:rect style="width:0;height:1.5pt" o:hralign="center" o:hrstd="t" o:hr="t"/>
+        </w:pict>
+      </w:r>
+    </w:p>
+    <w:bookmarkEnd w:id="22"/>
+    <w:bookmarkStart w:id="23" w:name="forensic-anchor--redgreen-evidence"/>
     <w:p>
       <w:pPr>
         <w:pStyle w:val="Heading2"/>
       </w:pPr>
       <w:r>
-        <w:t xml:space="preserve">Submodule pointer bumps</w:t>
+        <w:t xml:space="preserve">Forensic anchor — RED→GREEN evidence</w:t>
+      </w:r>
+    </w:p>
+    <w:p>
+      <w:pPr>
+        <w:pStyle w:val="FirstParagraph"/>
+      </w:pPr>
+      <w:r>
+        <w:t xml:space="preserve">For tests 46 + 48 specifically (the true RED-first per §11.4.43):</w:t>
+      </w:r>
+    </w:p>
+    <w:p>
+      <w:pPr>
+        <w:pStyle w:val="BodyText"/>
+      </w:pPr>
+      <w:r>
+        <w:rPr>
+          <w:b/>
+          <w:bCs/>
+        </w:rPr>
+        <w:t xml:space="preserve">RED state (stock v1.0.14, before fix):</w:t>
+      </w:r>
+    </w:p>
+    <w:p>
+      <w:pPr>
+        <w:pStyle w:val="SourceCode"/>
+      </w:pPr>
+      <w:r>
+        <w:rPr>
+          <w:rStyle w:val="VerbatimChar"/>
+        </w:rPr>
+        <w:t xml:space="preserve">$ bash scripts/tests/46_paste_in_physical.sh</w:t>
+      </w:r>
+      <w:r>
+        <w:br/>
+      </w:r>
+      <w:r>
+        <w:rPr>
+          <w:rStyle w:val="VerbatimChar"/>
+        </w:rPr>
+        <w:t xml:space="preserve">  ✗ template MISSING: @clip-read user option</w:t>
+      </w:r>
+      <w:r>
+        <w:br/>
+      </w:r>
+      <w:r>
+        <w:rPr>
+          <w:rStyle w:val="VerbatimChar"/>
+        </w:rPr>
+        <w:t xml:space="preserve">  ✗ template MISSING: prefix+P bind to paste</w:t>
+      </w:r>
+      <w:r>
+        <w:br/>
+      </w:r>
+      <w:r>
+        <w:rPr>
+          <w:rStyle w:val="VerbatimChar"/>
+        </w:rPr>
+        <w:t xml:space="preserve">FAIL: T1: tmux.conf.template is missing the paste-IN bindings</w:t>
+      </w:r>
+      <w:r>
+        <w:br/>
+      </w:r>
+      <w:r>
+        <w:rPr>
+          <w:rStyle w:val="VerbatimChar"/>
+        </w:rPr>
+        <w:t xml:space="preserve">FAIL: T2.1: live server has no @clip-read user-option</w:t>
+      </w:r>
+      <w:r>
+        <w:br/>
+      </w:r>
+      <w:r>
+        <w:rPr>
+          <w:rStyle w:val="VerbatimChar"/>
+        </w:rPr>
+        <w:t xml:space="preserve">FAIL: T2.2: live prefix+P binding is not a paste binding</w:t>
+      </w:r>
+      <w:r>
+        <w:br/>
+      </w:r>
+      <w:r>
+        <w:rPr>
+          <w:rStyle w:val="VerbatimChar"/>
+        </w:rPr>
+        <w:t xml:space="preserve">FAIL: T3: @clip-read not set on live server</w:t>
+      </w:r>
+      <w:r>
+        <w:br/>
+      </w:r>
+      <w:r>
+        <w:rPr>
+          <w:rStyle w:val="VerbatimChar"/>
+        </w:rPr>
+        <w:t xml:space="preserve">FAIL: T4: prefix+P bind does not reference @clip-read</w:t>
+      </w:r>
+      <w:r>
+        <w:br/>
+      </w:r>
+      <w:r>
+        <w:rPr>
+          <w:rStyle w:val="VerbatimChar"/>
+        </w:rPr>
+        <w:t xml:space="preserve">  Tests: PASS=1  FAIL=5  SKIP=0</w:t>
+      </w:r>
+      <w:r>
+        <w:br/>
+      </w:r>
+      <w:r>
+        <w:br/>
+      </w:r>
+      <w:r>
+        <w:rPr>
+          <w:rStyle w:val="VerbatimChar"/>
+        </w:rPr>
+        <w:t xml:space="preserve">$ bash scripts/tests/48_modifier_drag_override.sh</w:t>
+      </w:r>
+      <w:r>
+        <w:br/>
+      </w:r>
+      <w:r>
+        <w:rPr>
+          <w:rStyle w:val="VerbatimChar"/>
+        </w:rPr>
+        <w:t xml:space="preserve">  ✗ template MISSING: M-MouseDrag1Pane override</w:t>
+      </w:r>
+      <w:r>
+        <w:br/>
+      </w:r>
+      <w:r>
+        <w:rPr>
+          <w:rStyle w:val="VerbatimChar"/>
+        </w:rPr>
+        <w:t xml:space="preserve">  ✗ template MISSING: S-MouseDrag1Pane override</w:t>
+      </w:r>
+      <w:r>
+        <w:br/>
+      </w:r>
+      <w:r>
+        <w:rPr>
+          <w:rStyle w:val="VerbatimChar"/>
+        </w:rPr>
+        <w:t xml:space="preserve">  ✗ template MISSING: M-MouseDragEnd1Pane pipe</w:t>
+      </w:r>
+      <w:r>
+        <w:br/>
+      </w:r>
+      <w:r>
+        <w:rPr>
+          <w:rStyle w:val="VerbatimChar"/>
+        </w:rPr>
+        <w:t xml:space="preserve">  ✗ template MISSING: S-MouseDragEnd1Pane pipe</w:t>
+      </w:r>
+      <w:r>
+        <w:br/>
+      </w:r>
+      <w:r>
+        <w:rPr>
+          <w:rStyle w:val="VerbatimChar"/>
+        </w:rPr>
+        <w:t xml:space="preserve">FAIL: T1, T2.1, T2.2, T2.3, T2.4, T4</w:t>
+      </w:r>
+      <w:r>
+        <w:br/>
+      </w:r>
+      <w:r>
+        <w:rPr>
+          <w:rStyle w:val="VerbatimChar"/>
+        </w:rPr>
+        <w:t xml:space="preserve">  Tests: PASS=3  FAIL=6  SKIP=0</w:t>
+      </w:r>
+    </w:p>
+    <w:p>
+      <w:pPr>
+        <w:pStyle w:val="FirstParagraph"/>
+      </w:pPr>
+      <w:r>
+        <w:rPr>
+          <w:b/>
+          <w:bCs/>
+        </w:rPr>
+        <w:t xml:space="preserve">GREEN state (post-fix on same Mistborn this run):</w:t>
+      </w:r>
+    </w:p>
+    <w:p>
+      <w:pPr>
+        <w:pStyle w:val="SourceCode"/>
+      </w:pPr>
+      <w:r>
+        <w:rPr>
+          <w:rStyle w:val="VerbatimChar"/>
+        </w:rPr>
+        <w:t xml:space="preserve">$ bash scripts/tests/46_paste_in_physical.sh</w:t>
+      </w:r>
+      <w:r>
+        <w:br/>
+      </w:r>
+      <w:r>
+        <w:rPr>
+          <w:rStyle w:val="VerbatimChar"/>
+        </w:rPr>
+        <w:t xml:space="preserve">PASS: T3: PHYSICAL paste-IN proven — clipboard marker reached</w:t>
+      </w:r>
+      <w:r>
+        <w:br/>
+      </w:r>
+      <w:r>
+        <w:rPr>
+          <w:rStyle w:val="VerbatimChar"/>
+        </w:rPr>
+        <w:t xml:space="preserve">       the tmux pane via @clip-read + paste-buffer</w:t>
+      </w:r>
+      <w:r>
+        <w:br/>
+      </w:r>
+      <w:r>
+        <w:rPr>
+          <w:rStyle w:val="VerbatimChar"/>
+        </w:rPr>
+        <w:t xml:space="preserve">  Tests: PASS=6  FAIL=0  SKIP=0</w:t>
+      </w:r>
+      <w:r>
+        <w:br/>
+      </w:r>
+      <w:r>
+        <w:br/>
+      </w:r>
+      <w:r>
+        <w:rPr>
+          <w:rStyle w:val="VerbatimChar"/>
+        </w:rPr>
+        <w:t xml:space="preserve">$ bash scripts/tests/48_modifier_drag_override.sh</w:t>
+      </w:r>
+      <w:r>
+        <w:br/>
+      </w:r>
+      <w:r>
+        <w:rPr>
+          <w:rStyle w:val="VerbatimChar"/>
+        </w:rPr>
+        <w:t xml:space="preserve">PASS: T5: SYSTEM CLIPBOARD (pbcopy/pbpaste) carries all 6 markers</w:t>
+      </w:r>
+      <w:r>
+        <w:br/>
+      </w:r>
+      <w:r>
+        <w:rPr>
+          <w:rStyle w:val="VerbatimChar"/>
+        </w:rPr>
+        <w:t xml:space="preserve">       from the keyboard-equivalent modifier-drag flow</w:t>
+      </w:r>
+      <w:r>
+        <w:br/>
+      </w:r>
+      <w:r>
+        <w:rPr>
+          <w:rStyle w:val="VerbatimChar"/>
+        </w:rPr>
+        <w:t xml:space="preserve">  Tests: PASS=9  FAIL=0  SKIP=0</w:t>
+      </w:r>
+    </w:p>
+    <w:p>
+      <w:pPr>
+        <w:pStyle w:val="FirstParagraph"/>
+      </w:pPr>
+      <w:r>
+        <w:t xml:space="preserve">This is the §11.4.43 RED→GREEN cycle proven in a single Mistborn</w:t>
+      </w:r>
+      <w:r>
+        <w:t xml:space="preserve"> </w:t>
+      </w:r>
+      <w:r>
+        <w:t xml:space="preserve">session: tests authored before fix, fail on stock code, pass after</w:t>
+      </w:r>
+      <w:r>
+        <w:t xml:space="preserve"> </w:t>
+      </w:r>
+      <w:r>
+        <w:t xml:space="preserve">fix, captured-evidence per §11.4.5.</w:t>
+      </w:r>
+    </w:p>
+    <w:p>
+      <w:r>
+        <w:pict>
+          <v:rect style="width:0;height:1.5pt" o:hralign="center" o:hrstd="t" o:hr="t"/>
+        </w:pict>
+      </w:r>
+    </w:p>
+    <w:bookmarkEnd w:id="23"/>
+    <w:bookmarkStart w:id="24" w:name="files-modified"/>
+    <w:p>
+      <w:pPr>
+        <w:pStyle w:val="Heading2"/>
+      </w:pPr>
+      <w:r>
+        <w:t xml:space="preserve">Files modified</w:t>
       </w:r>
     </w:p>
     <w:p>
@@ -3177,40 +3470,13 @@
         <w:rPr>
           <w:rStyle w:val="VerbatimChar"/>
         </w:rPr>
-        <w:t xml:space="preserve">constitution/</w:t>
-      </w:r>
-      <w:r>
-        <w:t xml:space="preserve">:</w:t>
-      </w:r>
-      <w:r>
-        <w:t xml:space="preserve"> </w:t>
-      </w:r>
-      <w:r>
-        <w:rPr>
-          <w:rStyle w:val="VerbatimChar"/>
-        </w:rPr>
-        <w:t xml:space="preserve">84c948d</w:t>
-      </w:r>
-      <w:r>
-        <w:t xml:space="preserve"> </w:t>
-      </w:r>
-      <w:r>
-        <w:t xml:space="preserve">→</w:t>
-      </w:r>
-      <w:r>
-        <w:t xml:space="preserve"> </w:t>
-      </w:r>
-      <w:r>
-        <w:rPr>
-          <w:rStyle w:val="VerbatimChar"/>
-        </w:rPr>
-        <w:t xml:space="preserve">6828ff2</w:t>
-      </w:r>
-      <w:r>
-        <w:t xml:space="preserve"> </w:t>
-      </w:r>
-      <w:r>
-        <w:t xml:space="preserve">(19 commits, fast-forward)</w:t>
+        <w:t xml:space="preserve">scripts/tmux.conf.template</w:t>
+      </w:r>
+      <w:r>
+        <w:t xml:space="preserve"> </w:t>
+      </w:r>
+      <w:r>
+        <w:t xml:space="preserve">— A37 conf additions</w:t>
       </w:r>
     </w:p>
     <w:p>
@@ -3225,57 +3491,263 @@
         <w:rPr>
           <w:rStyle w:val="VerbatimChar"/>
         </w:rPr>
-        <w:t xml:space="preserve">Containers/</w:t>
-      </w:r>
-      <w:r>
-        <w:t xml:space="preserve">:</w:t>
-      </w:r>
-      <w:r>
-        <w:t xml:space="preserve"> </w:t>
-      </w:r>
-      <w:r>
-        <w:rPr>
-          <w:rStyle w:val="VerbatimChar"/>
-        </w:rPr>
-        <w:t xml:space="preserve">fbef9d6</w:t>
-      </w:r>
-      <w:r>
-        <w:t xml:space="preserve"> </w:t>
-      </w:r>
-      <w:r>
-        <w:t xml:space="preserve">→</w:t>
-      </w:r>
-      <w:r>
-        <w:t xml:space="preserve"> </w:t>
-      </w:r>
-      <w:r>
-        <w:rPr>
-          <w:rStyle w:val="VerbatimChar"/>
-        </w:rPr>
-        <w:t xml:space="preserve">2e9ca0e</w:t>
-      </w:r>
-      <w:r>
-        <w:t xml:space="preserve"> </w:t>
-      </w:r>
-      <w:r>
-        <w:t xml:space="preserve">(17 commits, fast-forward)</w:t>
-      </w:r>
-    </w:p>
-    <w:p>
-      <w:r>
-        <w:pict>
-          <v:rect style="width:0;height:1.5pt" o:hralign="center" o:hrstd="t" o:hr="t"/>
-        </w:pict>
-      </w:r>
-    </w:p>
-    <w:bookmarkEnd w:id="26"/>
-    <w:bookmarkStart w:id="27" w:name="Xebf4368bc77d3ac8bce7a22ae44f1da886499f0"/>
+        <w:t xml:space="preserve">scripts/verify.sh</w:t>
+      </w:r>
+      <w:r>
+        <w:t xml:space="preserve"> </w:t>
+      </w:r>
+      <w:r>
+        <w:t xml:space="preserve">— Layer-1 gates extended (PWU-A/B/C/D)</w:t>
+      </w:r>
+    </w:p>
+    <w:p>
+      <w:pPr>
+        <w:pStyle w:val="Compact"/>
+        <w:numPr>
+          <w:ilvl w:val="0"/>
+          <w:numId w:val="1006"/>
+        </w:numPr>
+      </w:pPr>
+      <w:r>
+        <w:rPr>
+          <w:rStyle w:val="VerbatimChar"/>
+        </w:rPr>
+        <w:t xml:space="preserve">scripts/tests/meta_test_false_positive_proof.sh</w:t>
+      </w:r>
+      <w:r>
+        <w:t xml:space="preserve"> </w:t>
+      </w:r>
+      <w:r>
+        <w:t xml:space="preserve">— M46 + M48</w:t>
+      </w:r>
+    </w:p>
+    <w:p>
+      <w:pPr>
+        <w:pStyle w:val="Compact"/>
+        <w:numPr>
+          <w:ilvl w:val="0"/>
+          <w:numId w:val="1006"/>
+        </w:numPr>
+      </w:pPr>
+      <w:r>
+        <w:rPr>
+          <w:rStyle w:val="VerbatimChar"/>
+        </w:rPr>
+        <w:t xml:space="preserve">scripts/challenges/tmux.yaml</w:t>
+      </w:r>
+      <w:r>
+        <w:t xml:space="preserve"> </w:t>
+      </w:r>
+      <w:r>
+        <w:t xml:space="preserve">— TMUX-CH-45/46/47/48</w:t>
+      </w:r>
+    </w:p>
+    <w:p>
+      <w:pPr>
+        <w:pStyle w:val="Compact"/>
+        <w:numPr>
+          <w:ilvl w:val="0"/>
+          <w:numId w:val="1006"/>
+        </w:numPr>
+      </w:pPr>
+      <w:r>
+        <w:rPr>
+          <w:rStyle w:val="VerbatimChar"/>
+        </w:rPr>
+        <w:t xml:space="preserve">scripts/sync_all_markdown_exports.sh</w:t>
+      </w:r>
+      <w:r>
+        <w:t xml:space="preserve"> </w:t>
+      </w:r>
+      <w:r>
+        <w:t xml:space="preserve">— NEW (PWU-D)</w:t>
+      </w:r>
+    </w:p>
+    <w:p>
+      <w:pPr>
+        <w:pStyle w:val="Compact"/>
+        <w:numPr>
+          <w:ilvl w:val="0"/>
+          <w:numId w:val="1006"/>
+        </w:numPr>
+      </w:pPr>
+      <w:r>
+        <w:rPr>
+          <w:rStyle w:val="VerbatimChar"/>
+        </w:rPr>
+        <w:t xml:space="preserve">Constitution.md</w:t>
+      </w:r>
+      <w:r>
+        <w:t xml:space="preserve"> </w:t>
+      </w:r>
+      <w:r>
+        <w:t xml:space="preserve">/</w:t>
+      </w:r>
+      <w:r>
+        <w:t xml:space="preserve"> </w:t>
+      </w:r>
+      <w:r>
+        <w:rPr>
+          <w:rStyle w:val="VerbatimChar"/>
+        </w:rPr>
+        <w:t xml:space="preserve">CLAUDE.md</w:t>
+      </w:r>
+      <w:r>
+        <w:t xml:space="preserve"> </w:t>
+      </w:r>
+      <w:r>
+        <w:t xml:space="preserve">/</w:t>
+      </w:r>
+      <w:r>
+        <w:t xml:space="preserve"> </w:t>
+      </w:r>
+      <w:r>
+        <w:rPr>
+          <w:rStyle w:val="VerbatimChar"/>
+        </w:rPr>
+        <w:t xml:space="preserve">AGENTS.md</w:t>
+      </w:r>
+      <w:r>
+        <w:t xml:space="preserve"> </w:t>
+      </w:r>
+      <w:r>
+        <w:t xml:space="preserve">/</w:t>
+      </w:r>
+      <w:r>
+        <w:t xml:space="preserve"> </w:t>
+      </w:r>
+      <w:r>
+        <w:rPr>
+          <w:rStyle w:val="VerbatimChar"/>
+        </w:rPr>
+        <w:t xml:space="preserve">QWEN.md</w:t>
+      </w:r>
+      <w:r>
+        <w:t xml:space="preserve"> </w:t>
+      </w:r>
+      <w:r>
+        <w:t xml:space="preserve">—</w:t>
+      </w:r>
+      <w:r>
+        <w:t xml:space="preserve"> </w:t>
+      </w:r>
+      <w:r>
+        <w:t xml:space="preserve">§11.4.87..98 short-form blocks (PWU-B)</w:t>
+      </w:r>
+    </w:p>
+    <w:p>
+      <w:pPr>
+        <w:pStyle w:val="Compact"/>
+        <w:numPr>
+          <w:ilvl w:val="0"/>
+          <w:numId w:val="1006"/>
+        </w:numPr>
+      </w:pPr>
+      <w:r>
+        <w:rPr>
+          <w:rStyle w:val="VerbatimChar"/>
+        </w:rPr>
+        <w:t xml:space="preserve">.gitignore</w:t>
+      </w:r>
+      <w:r>
+        <w:t xml:space="preserve"> </w:t>
+      </w:r>
+      <w:r>
+        <w:t xml:space="preserve">— workable-items DB carve-out (PWU-C)</w:t>
+      </w:r>
+    </w:p>
+    <w:p>
+      <w:pPr>
+        <w:pStyle w:val="Compact"/>
+        <w:numPr>
+          <w:ilvl w:val="0"/>
+          <w:numId w:val="1006"/>
+        </w:numPr>
+      </w:pPr>
+      <w:r>
+        <w:rPr>
+          <w:rStyle w:val="VerbatimChar"/>
+        </w:rPr>
+        <w:t xml:space="preserve">Fixed.md</w:t>
+      </w:r>
+      <w:r>
+        <w:t xml:space="preserve"> </w:t>
+      </w:r>
+      <w:r>
+        <w:t xml:space="preserve">— A37/A38/A39/A40 closures</w:t>
+      </w:r>
+    </w:p>
+    <w:p>
+      <w:pPr>
+        <w:pStyle w:val="Compact"/>
+        <w:numPr>
+          <w:ilvl w:val="0"/>
+          <w:numId w:val="1006"/>
+        </w:numPr>
+      </w:pPr>
+      <w:r>
+        <w:rPr>
+          <w:rStyle w:val="VerbatimChar"/>
+        </w:rPr>
+        <w:t xml:space="preserve">CHANGELOG.md</w:t>
+      </w:r>
+      <w:r>
+        <w:t xml:space="preserve"> </w:t>
+      </w:r>
+      <w:r>
+        <w:t xml:space="preserve">— v1.0.15 entry</w:t>
+      </w:r>
+    </w:p>
+    <w:p>
+      <w:pPr>
+        <w:pStyle w:val="Compact"/>
+        <w:numPr>
+          <w:ilvl w:val="0"/>
+          <w:numId w:val="1006"/>
+        </w:numPr>
+      </w:pPr>
+      <w:r>
+        <w:rPr>
+          <w:rStyle w:val="VerbatimChar"/>
+        </w:rPr>
+        <w:t xml:space="preserve">CONTINUATION.md</w:t>
+      </w:r>
+      <w:r>
+        <w:t xml:space="preserve"> </w:t>
+      </w:r>
+      <w:r>
+        <w:t xml:space="preserve">— §3.16 entry + timestamp bump</w:t>
+      </w:r>
+    </w:p>
+    <w:p>
+      <w:pPr>
+        <w:pStyle w:val="Compact"/>
+        <w:numPr>
+          <w:ilvl w:val="0"/>
+          <w:numId w:val="1006"/>
+        </w:numPr>
+      </w:pPr>
+      <w:r>
+        <w:rPr>
+          <w:rStyle w:val="VerbatimChar"/>
+        </w:rPr>
+        <w:t xml:space="preserve">VERSION</w:t>
+      </w:r>
+      <w:r>
+        <w:t xml:space="preserve"> </w:t>
+      </w:r>
+      <w:r>
+        <w:t xml:space="preserve">— 1.0.14 → 1.0.15 / versionCode 15 → 16</w:t>
+      </w:r>
+    </w:p>
+    <w:bookmarkEnd w:id="24"/>
+    <w:bookmarkStart w:id="25" w:name="files-created"/>
     <w:p>
       <w:pPr>
         <w:pStyle w:val="Heading2"/>
       </w:pPr>
       <w:r>
-        <w:t xml:space="preserve">§11.4.92 5-pass change-evaluation summary</w:t>
+        <w:t xml:space="preserve">Files created</w:t>
       </w:r>
     </w:p>
     <w:p>
@@ -3288,28 +3760,9 @@
       </w:pPr>
       <w:r>
         <w:rPr>
-          <w:b/>
-          <w:bCs/>
-        </w:rPr>
-        <w:t xml:space="preserve">Main task verification:</w:t>
-      </w:r>
-      <w:r>
-        <w:t xml:space="preserve"> </w:t>
-      </w:r>
-      <w:r>
-        <w:t xml:space="preserve">RED→GREEN evidence on tests 46 + 48</w:t>
-      </w:r>
-      <w:r>
-        <w:t xml:space="preserve"> </w:t>
-      </w:r>
-      <w:r>
-        <w:t xml:space="preserve">captured this run; multi-line keyboard copy proven via pbpaste</w:t>
-      </w:r>
-      <w:r>
-        <w:t xml:space="preserve"> </w:t>
-      </w:r>
-      <w:r>
-        <w:t xml:space="preserve">physical readback.</w:t>
+          <w:rStyle w:val="VerbatimChar"/>
+        </w:rPr>
+        <w:t xml:space="preserve">scripts/tests/45_multiline_copy_physical.sh</w:t>
       </w:r>
     </w:p>
     <w:p>
@@ -3322,34 +3775,9 @@
       </w:pPr>
       <w:r>
         <w:rPr>
-          <w:b/>
-          <w:bCs/>
-        </w:rPr>
-        <w:t xml:space="preserve">Regression blast radius:</w:t>
-      </w:r>
-      <w:r>
-        <w:t xml:space="preserve"> </w:t>
-      </w:r>
-      <w:r>
-        <w:t xml:space="preserve">all 41 existing tests + 4 new tests</w:t>
-      </w:r>
-      <w:r>
-        <w:t xml:space="preserve"> </w:t>
-      </w:r>
-      <w:r>
-        <w:t xml:space="preserve">= 45 PASS, no regression. Meta-test 43 caught, 2 pre-existing</w:t>
-      </w:r>
-      <w:r>
-        <w:t xml:space="preserve"> </w:t>
-      </w:r>
-      <w:r>
-        <w:t xml:space="preserve">escapes only. Existing tests 17 + 44 still PASS (the new bindings</w:t>
-      </w:r>
-      <w:r>
-        <w:t xml:space="preserve"> </w:t>
-      </w:r>
-      <w:r>
-        <w:t xml:space="preserve">don't shadow them).</w:t>
+          <w:rStyle w:val="VerbatimChar"/>
+        </w:rPr>
+        <w:t xml:space="preserve">scripts/tests/46_paste_in_physical.sh</w:t>
       </w:r>
     </w:p>
     <w:p>
@@ -3362,64 +3790,9 @@
       </w:pPr>
       <w:r>
         <w:rPr>
-          <w:b/>
-          <w:bCs/>
-        </w:rPr>
-        <w:t xml:space="preserve">Cross-feature interaction:</w:t>
-      </w:r>
-      <w:r>
-        <w:t xml:space="preserve"> </w:t>
-      </w:r>
-      <w:r>
-        <w:t xml:space="preserve">the M-/S-MouseDrag1Pane bindings</w:t>
-      </w:r>
-      <w:r>
-        <w:t xml:space="preserve"> </w:t>
-      </w:r>
-      <w:r>
-        <w:t xml:space="preserve">don't conflict with existing WheelUp / WheelDown /</w:t>
-      </w:r>
-      <w:r>
-        <w:t xml:space="preserve"> </w:t>
-      </w:r>
-      <w:r>
-        <w:rPr>
-          <w:rStyle w:val="VerbatimChar"/>
-        </w:rPr>
-        <w:t xml:space="preserve">v</w:t>
-      </w:r>
-      <w:r>
-        <w:t xml:space="preserve"> </w:t>
-      </w:r>
-      <w:r>
-        <w:t xml:space="preserve">/</w:t>
-      </w:r>
-      <w:r>
-        <w:t xml:space="preserve"> </w:t>
-      </w:r>
-      <w:r>
-        <w:rPr>
-          <w:rStyle w:val="VerbatimChar"/>
-        </w:rPr>
-        <w:t xml:space="preserve">y</w:t>
-      </w:r>
-      <w:r>
-        <w:t xml:space="preserve"> </w:t>
-      </w:r>
-      <w:r>
-        <w:t xml:space="preserve">bindings. @clip-read is a NEW user-option not interfering with</w:t>
-      </w:r>
-      <w:r>
-        <w:t xml:space="preserve"> </w:t>
-      </w:r>
-      <w:r>
-        <w:t xml:space="preserve">@clip. prefix+P doesn't collide with default tmux p (previous-</w:t>
-      </w:r>
-      <w:r>
-        <w:t xml:space="preserve"> </w:t>
-      </w:r>
-      <w:r>
-        <w:t xml:space="preserve">window) because we used uppercase P.</w:t>
+          <w:rStyle w:val="VerbatimChar"/>
+        </w:rPr>
+        <w:t xml:space="preserve">scripts/tests/47_alt_screen_scroll.sh</w:t>
       </w:r>
     </w:p>
     <w:p>
@@ -3432,28 +3805,9 @@
       </w:pPr>
       <w:r>
         <w:rPr>
-          <w:b/>
-          <w:bCs/>
-        </w:rPr>
-        <w:t xml:space="preserve">Deep research:</w:t>
-      </w:r>
-      <w:r>
-        <w:t xml:space="preserve"> </w:t>
-      </w:r>
-      <w:r>
-        <w:t xml:space="preserve">Claude Code's mouse-tracking via CSI ?1003h</w:t>
-      </w:r>
-      <w:r>
-        <w:t xml:space="preserve"> </w:t>
-      </w:r>
-      <w:r>
-        <w:t xml:space="preserve">verified via tmux source; modernc.org/sqlite cross-platform</w:t>
-      </w:r>
-      <w:r>
-        <w:t xml:space="preserve"> </w:t>
-      </w:r>
-      <w:r>
-        <w:t xml:space="preserve">compile verified by build-on-Darwin success.</w:t>
+          <w:rStyle w:val="VerbatimChar"/>
+        </w:rPr>
+        <w:t xml:space="preserve">scripts/tests/48_modifier_drag_override.sh</w:t>
       </w:r>
     </w:p>
     <w:p>
@@ -3462,6 +3816,445 @@
         <w:numPr>
           <w:ilvl w:val="0"/>
           <w:numId w:val="1007"/>
+        </w:numPr>
+      </w:pPr>
+      <w:r>
+        <w:rPr>
+          <w:rStyle w:val="VerbatimChar"/>
+        </w:rPr>
+        <w:t xml:space="preserve">scripts/tests/helpers/synthetic_alt_screen_app.py</w:t>
+      </w:r>
+    </w:p>
+    <w:p>
+      <w:pPr>
+        <w:pStyle w:val="Compact"/>
+        <w:numPr>
+          <w:ilvl w:val="0"/>
+          <w:numId w:val="1007"/>
+        </w:numPr>
+      </w:pPr>
+      <w:r>
+        <w:rPr>
+          <w:rStyle w:val="VerbatimChar"/>
+        </w:rPr>
+        <w:t xml:space="preserve">cmd/workable-items/{main.go,db.go,model.go,parser.go,sync_md_to_db.go,sync_db_to_md.go,diff.go,validate.go,add.go,close.go,schema.sql,db_test.go,roundtrip_test.go}</w:t>
+      </w:r>
+    </w:p>
+    <w:p>
+      <w:pPr>
+        <w:pStyle w:val="Compact"/>
+        <w:numPr>
+          <w:ilvl w:val="0"/>
+          <w:numId w:val="1007"/>
+        </w:numPr>
+      </w:pPr>
+      <w:r>
+        <w:rPr>
+          <w:rStyle w:val="VerbatimChar"/>
+        </w:rPr>
+        <w:t xml:space="preserve">cmd/workable-items/testdata/{golden_issues.md,golden_fixed.md}</w:t>
+      </w:r>
+    </w:p>
+    <w:p>
+      <w:pPr>
+        <w:pStyle w:val="Compact"/>
+        <w:numPr>
+          <w:ilvl w:val="0"/>
+          <w:numId w:val="1007"/>
+        </w:numPr>
+      </w:pPr>
+      <w:r>
+        <w:rPr>
+          <w:rStyle w:val="VerbatimChar"/>
+        </w:rPr>
+        <w:t xml:space="preserve">go.mod</w:t>
+      </w:r>
+      <w:r>
+        <w:t xml:space="preserve"> </w:t>
+      </w:r>
+      <w:r>
+        <w:t xml:space="preserve">+</w:t>
+      </w:r>
+      <w:r>
+        <w:t xml:space="preserve"> </w:t>
+      </w:r>
+      <w:r>
+        <w:rPr>
+          <w:rStyle w:val="VerbatimChar"/>
+        </w:rPr>
+        <w:t xml:space="preserve">go.sum</w:t>
+      </w:r>
+    </w:p>
+    <w:p>
+      <w:pPr>
+        <w:pStyle w:val="Compact"/>
+        <w:numPr>
+          <w:ilvl w:val="0"/>
+          <w:numId w:val="1007"/>
+        </w:numPr>
+      </w:pPr>
+      <w:r>
+        <w:rPr>
+          <w:rStyle w:val="VerbatimChar"/>
+        </w:rPr>
+        <w:t xml:space="preserve">docs/workable_items.db</w:t>
+      </w:r>
+      <w:r>
+        <w:t xml:space="preserve"> </w:t>
+      </w:r>
+      <w:r>
+        <w:t xml:space="preserve">— SQLite DB, tracked in git per §11.4.95</w:t>
+      </w:r>
+    </w:p>
+    <w:p>
+      <w:pPr>
+        <w:pStyle w:val="Compact"/>
+        <w:numPr>
+          <w:ilvl w:val="0"/>
+          <w:numId w:val="1007"/>
+        </w:numPr>
+      </w:pPr>
+      <w:r>
+        <w:rPr>
+          <w:rStyle w:val="VerbatimChar"/>
+        </w:rPr>
+        <w:t xml:space="preserve">docs/workable-items/{Status.md,Status_Summary.md}</w:t>
+      </w:r>
+      <w:r>
+        <w:t xml:space="preserve"> </w:t>
+      </w:r>
+      <w:r>
+        <w:t xml:space="preserve">— per §11.4.45/56</w:t>
+      </w:r>
+    </w:p>
+    <w:p>
+      <w:pPr>
+        <w:pStyle w:val="Compact"/>
+        <w:numPr>
+          <w:ilvl w:val="0"/>
+          <w:numId w:val="1007"/>
+        </w:numPr>
+      </w:pPr>
+      <w:r>
+        <w:rPr>
+          <w:rStyle w:val="VerbatimChar"/>
+        </w:rPr>
+        <w:t xml:space="preserve">docs/changelogs/v1.0.15.md</w:t>
+      </w:r>
+      <w:r>
+        <w:t xml:space="preserve"> </w:t>
+      </w:r>
+      <w:r>
+        <w:t xml:space="preserve">— this file</w:t>
+      </w:r>
+    </w:p>
+    <w:bookmarkEnd w:id="25"/>
+    <w:bookmarkStart w:id="26" w:name="submodule-pointer-bumps"/>
+    <w:p>
+      <w:pPr>
+        <w:pStyle w:val="Heading2"/>
+      </w:pPr>
+      <w:r>
+        <w:t xml:space="preserve">Submodule pointer bumps</w:t>
+      </w:r>
+    </w:p>
+    <w:p>
+      <w:pPr>
+        <w:pStyle w:val="Compact"/>
+        <w:numPr>
+          <w:ilvl w:val="0"/>
+          <w:numId w:val="1008"/>
+        </w:numPr>
+      </w:pPr>
+      <w:r>
+        <w:rPr>
+          <w:rStyle w:val="VerbatimChar"/>
+        </w:rPr>
+        <w:t xml:space="preserve">constitution/</w:t>
+      </w:r>
+      <w:r>
+        <w:t xml:space="preserve">:</w:t>
+      </w:r>
+      <w:r>
+        <w:t xml:space="preserve"> </w:t>
+      </w:r>
+      <w:r>
+        <w:rPr>
+          <w:rStyle w:val="VerbatimChar"/>
+        </w:rPr>
+        <w:t xml:space="preserve">84c948d</w:t>
+      </w:r>
+      <w:r>
+        <w:t xml:space="preserve"> </w:t>
+      </w:r>
+      <w:r>
+        <w:t xml:space="preserve">→</w:t>
+      </w:r>
+      <w:r>
+        <w:t xml:space="preserve"> </w:t>
+      </w:r>
+      <w:r>
+        <w:rPr>
+          <w:rStyle w:val="VerbatimChar"/>
+        </w:rPr>
+        <w:t xml:space="preserve">6828ff2</w:t>
+      </w:r>
+      <w:r>
+        <w:t xml:space="preserve"> </w:t>
+      </w:r>
+      <w:r>
+        <w:t xml:space="preserve">(19 commits, fast-forward)</w:t>
+      </w:r>
+    </w:p>
+    <w:p>
+      <w:pPr>
+        <w:pStyle w:val="Compact"/>
+        <w:numPr>
+          <w:ilvl w:val="0"/>
+          <w:numId w:val="1008"/>
+        </w:numPr>
+      </w:pPr>
+      <w:r>
+        <w:rPr>
+          <w:rStyle w:val="VerbatimChar"/>
+        </w:rPr>
+        <w:t xml:space="preserve">Containers/</w:t>
+      </w:r>
+      <w:r>
+        <w:t xml:space="preserve">:</w:t>
+      </w:r>
+      <w:r>
+        <w:t xml:space="preserve"> </w:t>
+      </w:r>
+      <w:r>
+        <w:rPr>
+          <w:rStyle w:val="VerbatimChar"/>
+        </w:rPr>
+        <w:t xml:space="preserve">fbef9d6</w:t>
+      </w:r>
+      <w:r>
+        <w:t xml:space="preserve"> </w:t>
+      </w:r>
+      <w:r>
+        <w:t xml:space="preserve">→</w:t>
+      </w:r>
+      <w:r>
+        <w:t xml:space="preserve"> </w:t>
+      </w:r>
+      <w:r>
+        <w:rPr>
+          <w:rStyle w:val="VerbatimChar"/>
+        </w:rPr>
+        <w:t xml:space="preserve">2e9ca0e</w:t>
+      </w:r>
+      <w:r>
+        <w:t xml:space="preserve"> </w:t>
+      </w:r>
+      <w:r>
+        <w:t xml:space="preserve">(17 commits, fast-forward)</w:t>
+      </w:r>
+    </w:p>
+    <w:p>
+      <w:r>
+        <w:pict>
+          <v:rect style="width:0;height:1.5pt" o:hralign="center" o:hrstd="t" o:hr="t"/>
+        </w:pict>
+      </w:r>
+    </w:p>
+    <w:bookmarkEnd w:id="26"/>
+    <w:bookmarkStart w:id="27" w:name="Xebf4368bc77d3ac8bce7a22ae44f1da886499f0"/>
+    <w:p>
+      <w:pPr>
+        <w:pStyle w:val="Heading2"/>
+      </w:pPr>
+      <w:r>
+        <w:t xml:space="preserve">§11.4.92 5-pass change-evaluation summary</w:t>
+      </w:r>
+    </w:p>
+    <w:p>
+      <w:pPr>
+        <w:pStyle w:val="Compact"/>
+        <w:numPr>
+          <w:ilvl w:val="0"/>
+          <w:numId w:val="1009"/>
+        </w:numPr>
+      </w:pPr>
+      <w:r>
+        <w:rPr>
+          <w:b/>
+          <w:bCs/>
+        </w:rPr>
+        <w:t xml:space="preserve">Main task verification:</w:t>
+      </w:r>
+      <w:r>
+        <w:t xml:space="preserve"> </w:t>
+      </w:r>
+      <w:r>
+        <w:t xml:space="preserve">RED→GREEN evidence on tests 46 + 48</w:t>
+      </w:r>
+      <w:r>
+        <w:t xml:space="preserve"> </w:t>
+      </w:r>
+      <w:r>
+        <w:t xml:space="preserve">captured this run; multi-line keyboard copy proven via pbpaste</w:t>
+      </w:r>
+      <w:r>
+        <w:t xml:space="preserve"> </w:t>
+      </w:r>
+      <w:r>
+        <w:t xml:space="preserve">physical readback.</w:t>
+      </w:r>
+    </w:p>
+    <w:p>
+      <w:pPr>
+        <w:pStyle w:val="Compact"/>
+        <w:numPr>
+          <w:ilvl w:val="0"/>
+          <w:numId w:val="1009"/>
+        </w:numPr>
+      </w:pPr>
+      <w:r>
+        <w:rPr>
+          <w:b/>
+          <w:bCs/>
+        </w:rPr>
+        <w:t xml:space="preserve">Regression blast radius:</w:t>
+      </w:r>
+      <w:r>
+        <w:t xml:space="preserve"> </w:t>
+      </w:r>
+      <w:r>
+        <w:t xml:space="preserve">all 41 existing tests + 4 new tests</w:t>
+      </w:r>
+      <w:r>
+        <w:t xml:space="preserve"> </w:t>
+      </w:r>
+      <w:r>
+        <w:t xml:space="preserve">= 45 PASS, no regression. Meta-test 43 caught, 2 pre-existing</w:t>
+      </w:r>
+      <w:r>
+        <w:t xml:space="preserve"> </w:t>
+      </w:r>
+      <w:r>
+        <w:t xml:space="preserve">escapes only. Existing tests 17 + 44 still PASS (the new bindings</w:t>
+      </w:r>
+      <w:r>
+        <w:t xml:space="preserve"> </w:t>
+      </w:r>
+      <w:r>
+        <w:t xml:space="preserve">don't shadow them).</w:t>
+      </w:r>
+    </w:p>
+    <w:p>
+      <w:pPr>
+        <w:pStyle w:val="Compact"/>
+        <w:numPr>
+          <w:ilvl w:val="0"/>
+          <w:numId w:val="1009"/>
+        </w:numPr>
+      </w:pPr>
+      <w:r>
+        <w:rPr>
+          <w:b/>
+          <w:bCs/>
+        </w:rPr>
+        <w:t xml:space="preserve">Cross-feature interaction:</w:t>
+      </w:r>
+      <w:r>
+        <w:t xml:space="preserve"> </w:t>
+      </w:r>
+      <w:r>
+        <w:t xml:space="preserve">the M-/S-MouseDrag1Pane bindings</w:t>
+      </w:r>
+      <w:r>
+        <w:t xml:space="preserve"> </w:t>
+      </w:r>
+      <w:r>
+        <w:t xml:space="preserve">don't conflict with existing WheelUp / WheelDown /</w:t>
+      </w:r>
+      <w:r>
+        <w:t xml:space="preserve"> </w:t>
+      </w:r>
+      <w:r>
+        <w:rPr>
+          <w:rStyle w:val="VerbatimChar"/>
+        </w:rPr>
+        <w:t xml:space="preserve">v</w:t>
+      </w:r>
+      <w:r>
+        <w:t xml:space="preserve"> </w:t>
+      </w:r>
+      <w:r>
+        <w:t xml:space="preserve">/</w:t>
+      </w:r>
+      <w:r>
+        <w:t xml:space="preserve"> </w:t>
+      </w:r>
+      <w:r>
+        <w:rPr>
+          <w:rStyle w:val="VerbatimChar"/>
+        </w:rPr>
+        <w:t xml:space="preserve">y</w:t>
+      </w:r>
+      <w:r>
+        <w:t xml:space="preserve"> </w:t>
+      </w:r>
+      <w:r>
+        <w:t xml:space="preserve">bindings. @clip-read is a NEW user-option not interfering with</w:t>
+      </w:r>
+      <w:r>
+        <w:t xml:space="preserve"> </w:t>
+      </w:r>
+      <w:r>
+        <w:t xml:space="preserve">@clip. prefix+P doesn't collide with default tmux p (previous-</w:t>
+      </w:r>
+      <w:r>
+        <w:t xml:space="preserve"> </w:t>
+      </w:r>
+      <w:r>
+        <w:t xml:space="preserve">window) because we used uppercase P.</w:t>
+      </w:r>
+    </w:p>
+    <w:p>
+      <w:pPr>
+        <w:pStyle w:val="Compact"/>
+        <w:numPr>
+          <w:ilvl w:val="0"/>
+          <w:numId w:val="1009"/>
+        </w:numPr>
+      </w:pPr>
+      <w:r>
+        <w:rPr>
+          <w:b/>
+          <w:bCs/>
+        </w:rPr>
+        <w:t xml:space="preserve">Deep research:</w:t>
+      </w:r>
+      <w:r>
+        <w:t xml:space="preserve"> </w:t>
+      </w:r>
+      <w:r>
+        <w:t xml:space="preserve">Claude Code's mouse-tracking via CSI ?1003h</w:t>
+      </w:r>
+      <w:r>
+        <w:t xml:space="preserve"> </w:t>
+      </w:r>
+      <w:r>
+        <w:t xml:space="preserve">verified via tmux source; modernc.org/sqlite cross-platform</w:t>
+      </w:r>
+      <w:r>
+        <w:t xml:space="preserve"> </w:t>
+      </w:r>
+      <w:r>
+        <w:t xml:space="preserve">compile verified by build-on-Darwin success.</w:t>
+      </w:r>
+    </w:p>
+    <w:p>
+      <w:pPr>
+        <w:pStyle w:val="Compact"/>
+        <w:numPr>
+          <w:ilvl w:val="0"/>
+          <w:numId w:val="1009"/>
         </w:numPr>
       </w:pPr>
       <w:r>
@@ -3836,6 +4629,12 @@
     <w:abstractNumId w:val="991"/>
   </w:num>
   <w:num w:numId="1007">
+    <w:abstractNumId w:val="991"/>
+  </w:num>
+  <w:num w:numId="1008">
+    <w:abstractNumId w:val="991"/>
+  </w:num>
+  <w:num w:numId="1009">
     <w:abstractNumId w:val="99411"/>
     <w:lvlOverride w:ilvl="0">
       <w:startOverride w:val="1"/>

</xml_diff>